<commit_message>
Added to review responses
</commit_message>
<xml_diff>
--- a/Sci Adv_Review Responses.docx
+++ b/Sci Adv_Review Responses.docx
@@ -1548,6 +1548,7 @@
           <w:rFonts w:ascii="Times New Roman" w:eastAsia="Times New Roman" w:hAnsi="Times New Roman" w:cs="Times New Roman"/>
           <w:color w:val="0070C0"/>
           <w:kern w:val="0"/>
+          <w:highlight w:val="yellow"/>
           <w:shd w:val="clear" w:color="auto" w:fill="FFFFFF"/>
           <w:lang w:eastAsia="en-GB"/>
           <w14:ligatures w14:val="none"/>
@@ -1561,6 +1562,7 @@
           <w:iCs/>
           <w:color w:val="0070C0"/>
           <w:kern w:val="0"/>
+          <w:highlight w:val="yellow"/>
           <w:shd w:val="clear" w:color="auto" w:fill="FFFFFF"/>
           <w:lang w:eastAsia="en-GB"/>
           <w14:ligatures w14:val="none"/>
@@ -1574,11 +1576,12 @@
           <w:iCs/>
           <w:color w:val="0070C0"/>
           <w:kern w:val="0"/>
-          <w:shd w:val="clear" w:color="auto" w:fill="FFFFFF"/>
-          <w:lang w:eastAsia="en-GB"/>
-          <w14:ligatures w14:val="none"/>
-        </w:rPr>
-        <w:t>Add</w:t>
+          <w:highlight w:val="yellow"/>
+          <w:shd w:val="clear" w:color="auto" w:fill="FFFFFF"/>
+          <w:lang w:eastAsia="en-GB"/>
+          <w14:ligatures w14:val="none"/>
+        </w:rPr>
+        <w:t>Add a</w:t>
       </w:r>
       <w:r>
         <w:rPr>
@@ -1587,11 +1590,12 @@
           <w:iCs/>
           <w:color w:val="0070C0"/>
           <w:kern w:val="0"/>
-          <w:shd w:val="clear" w:color="auto" w:fill="FFFFFF"/>
-          <w:lang w:eastAsia="en-GB"/>
-          <w14:ligatures w14:val="none"/>
-        </w:rPr>
-        <w:t xml:space="preserve"> a</w:t>
+          <w:highlight w:val="yellow"/>
+          <w:shd w:val="clear" w:color="auto" w:fill="FFFFFF"/>
+          <w:lang w:eastAsia="en-GB"/>
+          <w14:ligatures w14:val="none"/>
+        </w:rPr>
+        <w:t>n</w:t>
       </w:r>
       <w:r>
         <w:rPr>
@@ -1600,11 +1604,12 @@
           <w:iCs/>
           <w:color w:val="0070C0"/>
           <w:kern w:val="0"/>
-          <w:shd w:val="clear" w:color="auto" w:fill="FFFFFF"/>
-          <w:lang w:eastAsia="en-GB"/>
-          <w14:ligatures w14:val="none"/>
-        </w:rPr>
-        <w:t>n</w:t>
+          <w:highlight w:val="yellow"/>
+          <w:shd w:val="clear" w:color="auto" w:fill="FFFFFF"/>
+          <w:lang w:eastAsia="en-GB"/>
+          <w14:ligatures w14:val="none"/>
+        </w:rPr>
+        <w:t xml:space="preserve"> analysis comparing mean temperature and thermal variability across the different ecosystem types. Recreate Fig 2B but using thermal mean and variance instead of fractal dimension and rugosity. Fig 2B can then become panel A alongside this climate comparison. With the ridge plots being supplemental underpinnings of these patterns showing </w:t>
       </w:r>
       <w:r>
         <w:rPr>
@@ -1613,11 +1618,13 @@
           <w:iCs/>
           <w:color w:val="0070C0"/>
           <w:kern w:val="0"/>
-          <w:shd w:val="clear" w:color="auto" w:fill="FFFFFF"/>
-          <w:lang w:eastAsia="en-GB"/>
-          <w14:ligatures w14:val="none"/>
-        </w:rPr>
-        <w:t xml:space="preserve"> analysis comparing mean temperature and thermal variability across the different ecosystem types. Recreate Fig 2B but using thermal mean and variance instead of fractal dimension and rugosity. Fig 2B can then become panel A alongside this climate comparison. With the ridge plots being supplemental underpinnings of these patterns showing </w:t>
+          <w:highlight w:val="yellow"/>
+          <w:shd w:val="clear" w:color="auto" w:fill="FFFFFF"/>
+          <w:lang w:eastAsia="en-GB"/>
+          <w14:ligatures w14:val="none"/>
+        </w:rPr>
+        <w:lastRenderedPageBreak/>
+        <w:t>the true distributions of the complexity and climate variables.</w:t>
       </w:r>
       <w:r>
         <w:rPr>
@@ -1626,12 +1633,12 @@
           <w:iCs/>
           <w:color w:val="0070C0"/>
           <w:kern w:val="0"/>
-          <w:shd w:val="clear" w:color="auto" w:fill="FFFFFF"/>
-          <w:lang w:eastAsia="en-GB"/>
-          <w14:ligatures w14:val="none"/>
-        </w:rPr>
-        <w:lastRenderedPageBreak/>
-        <w:t>the true distributions of the complexity and climate variables.</w:t>
+          <w:highlight w:val="yellow"/>
+          <w:shd w:val="clear" w:color="auto" w:fill="FFFFFF"/>
+          <w:lang w:eastAsia="en-GB"/>
+          <w14:ligatures w14:val="none"/>
+        </w:rPr>
+        <w:t xml:space="preserve"> Combine this with a statistical test </w:t>
       </w:r>
       <w:r>
         <w:rPr>
@@ -1640,11 +1647,12 @@
           <w:iCs/>
           <w:color w:val="0070C0"/>
           <w:kern w:val="0"/>
-          <w:shd w:val="clear" w:color="auto" w:fill="FFFFFF"/>
-          <w:lang w:eastAsia="en-GB"/>
-          <w14:ligatures w14:val="none"/>
-        </w:rPr>
-        <w:t xml:space="preserve"> Combine this with a statistical test </w:t>
+          <w:highlight w:val="yellow"/>
+          <w:shd w:val="clear" w:color="auto" w:fill="FFFFFF"/>
+          <w:lang w:eastAsia="en-GB"/>
+          <w14:ligatures w14:val="none"/>
+        </w:rPr>
+        <w:t xml:space="preserve">(Permanova using adonis function in r) </w:t>
       </w:r>
       <w:r>
         <w:rPr>
@@ -1653,11 +1661,12 @@
           <w:iCs/>
           <w:color w:val="0070C0"/>
           <w:kern w:val="0"/>
-          <w:shd w:val="clear" w:color="auto" w:fill="FFFFFF"/>
-          <w:lang w:eastAsia="en-GB"/>
-          <w14:ligatures w14:val="none"/>
-        </w:rPr>
-        <w:t xml:space="preserve">(Permanova using adonis function in r) </w:t>
+          <w:highlight w:val="yellow"/>
+          <w:shd w:val="clear" w:color="auto" w:fill="FFFFFF"/>
+          <w:lang w:eastAsia="en-GB"/>
+          <w14:ligatures w14:val="none"/>
+        </w:rPr>
+        <w:t>comparing the within and between variance in structural complexity estimates across ecosystem types</w:t>
       </w:r>
       <w:r>
         <w:rPr>
@@ -1666,19 +1675,7 @@
           <w:iCs/>
           <w:color w:val="0070C0"/>
           <w:kern w:val="0"/>
-          <w:shd w:val="clear" w:color="auto" w:fill="FFFFFF"/>
-          <w:lang w:eastAsia="en-GB"/>
-          <w14:ligatures w14:val="none"/>
-        </w:rPr>
-        <w:t>comparing the within and between variance in structural complexity estimates across ecosystem types</w:t>
-      </w:r>
-      <w:r>
-        <w:rPr>
-          <w:rFonts w:ascii="Times New Roman" w:eastAsia="Times New Roman" w:hAnsi="Times New Roman" w:cs="Times New Roman"/>
-          <w:i/>
-          <w:iCs/>
-          <w:color w:val="0070C0"/>
-          <w:kern w:val="0"/>
+          <w:highlight w:val="yellow"/>
           <w:shd w:val="clear" w:color="auto" w:fill="FFFFFF"/>
           <w:lang w:eastAsia="en-GB"/>
           <w14:ligatures w14:val="none"/>
@@ -1861,31 +1858,48 @@
         <w:rPr>
           <w:rFonts w:ascii="Times New Roman" w:hAnsi="Times New Roman" w:cs="Times New Roman"/>
         </w:rPr>
-        <w:t xml:space="preserve">The hurdle model results are not that clear-cut. Ok, occupancy decreases with complexity, but density is largely independent of </w:t>
+        <w:t xml:space="preserve">The hurdle model results are not that clear-cut. </w:t>
+      </w:r>
+      <w:r>
+        <w:rPr>
+          <w:rFonts w:ascii="Times New Roman" w:hAnsi="Times New Roman" w:cs="Times New Roman"/>
+          <w:highlight w:val="yellow"/>
+        </w:rPr>
+        <w:t xml:space="preserve">Ok, occupancy decreases with complexity, but density is largely independent of </w:t>
       </w:r>
       <w:r>
         <w:rPr>
           <w:rFonts w:ascii="Cambria Math" w:hAnsi="Cambria Math" w:cs="Cambria Math"/>
+          <w:highlight w:val="yellow"/>
         </w:rPr>
         <w:t>𝑅</w:t>
       </w:r>
       <w:r>
         <w:rPr>
           <w:rFonts w:ascii="Times New Roman" w:hAnsi="Times New Roman" w:cs="Times New Roman"/>
+          <w:highlight w:val="yellow"/>
         </w:rPr>
         <w:t xml:space="preserve"> and Δ</w:t>
       </w:r>
       <w:r>
         <w:rPr>
           <w:rFonts w:ascii="Cambria Math" w:hAnsi="Cambria Math" w:cs="Cambria Math"/>
+          <w:highlight w:val="yellow"/>
         </w:rPr>
         <w:t>𝐻</w:t>
       </w:r>
       <w:r>
         <w:rPr>
           <w:rFonts w:ascii="Times New Roman" w:hAnsi="Times New Roman" w:cs="Times New Roman"/>
-        </w:rPr>
-        <w:t>. This means that once people are present, how many people live there is not strongly determined by rugosity or height range — only fractal dimension matters. This is an interesting finding that may complicate H2 rather than straightforwardly supporting it. The paper’s framing emphasizes the occupancy effect,</w:t>
+          <w:highlight w:val="yellow"/>
+        </w:rPr>
+        <w:t>. This means that once people are present, how many people live there is not strongly determined by rugosity or height range — only fractal dimension matters.</w:t>
+      </w:r>
+      <w:r>
+        <w:rPr>
+          <w:rFonts w:ascii="Times New Roman" w:hAnsi="Times New Roman" w:cs="Times New Roman"/>
+        </w:rPr>
+        <w:t xml:space="preserve"> This is an interesting finding that may complicate H2 rather than straightforwardly supporting it. The paper’s framing emphasizes the occupancy effect,</w:t>
       </w:r>
       <w:r>
         <w:rPr>
@@ -5341,18 +5355,7 @@
           <w:lang w:eastAsia="en-GB"/>
           <w14:ligatures w14:val="none"/>
         </w:rPr>
-        <w:t xml:space="preserve"> to provide a </w:t>
-      </w:r>
-      <w:r>
-        <w:rPr>
-          <w:rFonts w:ascii="Times New Roman" w:eastAsia="Times New Roman" w:hAnsi="Times New Roman" w:cs="Times New Roman"/>
-          <w:color w:val="0070C0"/>
-          <w:kern w:val="0"/>
-          <w:shd w:val="clear" w:color="auto" w:fill="FFFFFF"/>
-          <w:lang w:eastAsia="en-GB"/>
-          <w14:ligatures w14:val="none"/>
-        </w:rPr>
-        <w:t>more comprehensive overview</w:t>
+        <w:t xml:space="preserve"> to provide a more comprehensive overview</w:t>
       </w:r>
       <w:r>
         <w:rPr>
@@ -5854,29 +5857,7 @@
           <w:lang w:eastAsia="en-GB"/>
           <w14:ligatures w14:val="none"/>
         </w:rPr>
-        <w:t xml:space="preserve">With the native reprojection resulting in a resolution of </w:t>
-      </w:r>
-      <w:r>
-        <w:rPr>
-          <w:rFonts w:ascii="Times New Roman" w:eastAsia="Times New Roman" w:hAnsi="Times New Roman" w:cs="Times New Roman"/>
-          <w:color w:val="0070C0"/>
-          <w:kern w:val="0"/>
-          <w:shd w:val="clear" w:color="auto" w:fill="FFFFFF"/>
-          <w:lang w:eastAsia="en-GB"/>
-          <w14:ligatures w14:val="none"/>
-        </w:rPr>
-        <w:t>186.754075 m</w:t>
-      </w:r>
-      <w:r>
-        <w:rPr>
-          <w:rFonts w:ascii="Times New Roman" w:eastAsia="Times New Roman" w:hAnsi="Times New Roman" w:cs="Times New Roman"/>
-          <w:color w:val="0070C0"/>
-          <w:kern w:val="0"/>
-          <w:shd w:val="clear" w:color="auto" w:fill="FFFFFF"/>
-          <w:lang w:eastAsia="en-GB"/>
-          <w14:ligatures w14:val="none"/>
-        </w:rPr>
-        <w:t xml:space="preserve"> we subsequently opted to impose a minimum resolution of 187 m to simplify our subsequent analyses. In our revised manuscript we have now expanded on our reprojection approach to clarify that we have not interpolated any data (</w:t>
+        <w:t>With the native reprojection resulting in a resolution of 186.754075 m we subsequently opted to impose a minimum resolution of 187 m to simplify our subsequent analyses. In our revised manuscript we have now expanded on our reprojection approach to clarify that we have not interpolated any data (</w:t>
       </w:r>
       <w:r>
         <w:rPr>
@@ -6000,21 +5981,7 @@
           <w:rFonts w:ascii="Times New Roman" w:hAnsi="Times New Roman" w:cs="Times New Roman"/>
           <w:color w:val="0070C0"/>
         </w:rPr>
-        <w:t xml:space="preserve"> </w:t>
-      </w:r>
-      <w:r>
-        <w:rPr>
-          <w:rFonts w:ascii="Times New Roman" w:hAnsi="Times New Roman" w:cs="Times New Roman"/>
-          <w:color w:val="0070C0"/>
-        </w:rPr>
-        <w:t>straight-line</w:t>
-      </w:r>
-      <w:r>
-        <w:rPr>
-          <w:rFonts w:ascii="Times New Roman" w:hAnsi="Times New Roman" w:cs="Times New Roman"/>
-          <w:color w:val="0070C0"/>
-        </w:rPr>
-        <w:t xml:space="preserve"> pathways across the earth’s surface.</w:t>
+        <w:t xml:space="preserve"> straight-line pathways across the earth’s surface.</w:t>
       </w:r>
       <w:r>
         <w:rPr>
@@ -6067,7 +6034,7 @@
           <w:iCs/>
           <w:color w:val="0070C0"/>
         </w:rPr>
-        <w:t>Initially we merged 15 arc-second resolution terrain raster tiles (EPSG: 4326, WGS84) downloaded from GEBCO to produce a global map of surface elevation in metres. To ensure a consistent scale across raster pixels, we reprojected this elevation model (henceforth digital elevation model [DEM]) to an equal-area Mollweide projection (EPSG: 54009) using bilinear resampling. Note, the native reprojection (i.e., the use of default parameters)</w:t>
+        <w:t>Initially we merged 15 arc-second resolution terrain raster tiles (EPSG: 4326, WGS84) downloaded from GEBCO to produce a global map of surface elevation in metres. To ensure a consistent scale across raster pixels, we reprojected this elevation model (henceforth digital elevation model [DEM]) to an equal-area Mollweide projection (EPSG: 54009) using bilinear resampling. Note, the native reprojection (i.e., the use of default parameters) of the WGS84 GEBCO DEM to an equal-area Mollweide projection results in a resolution of 186.754 m. Thus, to simplify our subsequent computation of geometric indices, during this reprojection we imposed a minimum resolution of 187 m (L</w:t>
       </w:r>
       <w:r>
         <w:rPr>
@@ -6075,8 +6042,9 @@
           <w:i/>
           <w:iCs/>
           <w:color w:val="0070C0"/>
-        </w:rPr>
-        <w:t xml:space="preserve"> </w:t>
+          <w:vertAlign w:val="subscript"/>
+        </w:rPr>
+        <w:t>0</w:t>
       </w:r>
       <w:r>
         <w:rPr>
@@ -6085,7 +6053,7 @@
           <w:iCs/>
           <w:color w:val="0070C0"/>
         </w:rPr>
-        <w:t>of the WGS84 GEBCO DEM to an equal-area Mollweide projection results in a resolution of 186.754 m. Thus, to simplify our subsequent computation of geometric indices, during this reprojection we imposed a minimum resolution of 187 m (L</w:t>
+        <w:t>). From this reprojected DEM, using the associated functions contained in the habtools package (9</w:t>
       </w:r>
       <w:r>
         <w:rPr>
@@ -6093,9 +6061,8 @@
           <w:i/>
           <w:iCs/>
           <w:color w:val="0070C0"/>
-          <w:vertAlign w:val="subscript"/>
-        </w:rPr>
-        <w:t>0</w:t>
+        </w:rPr>
+        <w:t>1</w:t>
       </w:r>
       <w:r>
         <w:rPr>
@@ -6104,61 +6071,7 @@
           <w:iCs/>
           <w:color w:val="0070C0"/>
         </w:rPr>
-        <w:t xml:space="preserve">). From </w:t>
-      </w:r>
-      <w:r>
-        <w:rPr>
-          <w:rFonts w:ascii="Times New Roman" w:hAnsi="Times New Roman" w:cs="Times New Roman"/>
-          <w:i/>
-          <w:iCs/>
-          <w:color w:val="0070C0"/>
-        </w:rPr>
-        <w:t>this</w:t>
-      </w:r>
-      <w:r>
-        <w:rPr>
-          <w:rFonts w:ascii="Times New Roman" w:hAnsi="Times New Roman" w:cs="Times New Roman"/>
-          <w:i/>
-          <w:iCs/>
-          <w:color w:val="0070C0"/>
-        </w:rPr>
-        <w:t xml:space="preserve"> reprojected DEM, using the associated functions contained in the habtools package</w:t>
-      </w:r>
-      <w:r>
-        <w:rPr>
-          <w:rFonts w:ascii="Times New Roman" w:hAnsi="Times New Roman" w:cs="Times New Roman"/>
-          <w:i/>
-          <w:iCs/>
-          <w:color w:val="0070C0"/>
-        </w:rPr>
-        <w:t xml:space="preserve"> (9</w:t>
-      </w:r>
-      <w:r>
-        <w:rPr>
-          <w:rFonts w:ascii="Times New Roman" w:hAnsi="Times New Roman" w:cs="Times New Roman"/>
-          <w:i/>
-          <w:iCs/>
-          <w:color w:val="0070C0"/>
-        </w:rPr>
-        <w:t>1</w:t>
-      </w:r>
-      <w:r>
-        <w:rPr>
-          <w:rFonts w:ascii="Times New Roman" w:hAnsi="Times New Roman" w:cs="Times New Roman"/>
-          <w:i/>
-          <w:iCs/>
-          <w:color w:val="0070C0"/>
-        </w:rPr>
-        <w:t>)</w:t>
-      </w:r>
-      <w:r>
-        <w:rPr>
-          <w:rFonts w:ascii="Times New Roman" w:hAnsi="Times New Roman" w:cs="Times New Roman"/>
-          <w:i/>
-          <w:iCs/>
-          <w:color w:val="0070C0"/>
-        </w:rPr>
-        <w:t xml:space="preserve"> we then extracted estimates of ΔH, R, and D, at a scale of 1870 m (L; one order of magnitude greater than L</w:t>
+        <w:t>) we then extracted estimates of ΔH, R, and D, at a scale of 1870 m (L; one order of magnitude greater than L</w:t>
       </w:r>
       <w:r>
         <w:rPr>
@@ -8214,6 +8127,7 @@
   <w:style w:type="character" w:default="1" w:styleId="DefaultParagraphFont">
     <w:name w:val="Default Paragraph Font"/>
     <w:uiPriority w:val="1"/>
+    <w:semiHidden/>
     <w:unhideWhenUsed/>
   </w:style>
   <w:style w:type="table" w:default="1" w:styleId="TableNormal">

</xml_diff>

<commit_message>
Added to island biodiversity case study
</commit_message>
<xml_diff>
--- a/Sci Adv_Review Responses.docx
+++ b/Sci Adv_Review Responses.docx
@@ -407,7 +407,31 @@
           <w:lang w:eastAsia="en-GB"/>
           <w14:ligatures w14:val="none"/>
         </w:rPr>
-        <w:t>our manuscript and its associated global complexity data products offer to assessments of global biodiversity patterns. We also appreciate their perspective that this research reflects an ambitious body of work. We note, that in the communications we received following the peer-review of our manuscript there appeared to have been some duplication of the text outlining the Editors feedback for us. Thus, in our response document here, we have endeavored to condense this feedback to allow us to more concisely respond to each of the Editors’ concerns.</w:t>
+        <w:t xml:space="preserve">our manuscript and its associated global complexity data products offer to assessments of global biodiversity patterns. We also appreciate their perspective that this research reflects an ambitious body of work. We </w:t>
+      </w:r>
+      <w:proofErr w:type="gramStart"/>
+      <w:r>
+        <w:rPr>
+          <w:rFonts w:ascii="Times New Roman" w:eastAsia="Times New Roman" w:hAnsi="Times New Roman" w:cs="Times New Roman"/>
+          <w:color w:val="0070C0"/>
+          <w:kern w:val="0"/>
+          <w:shd w:val="clear" w:color="auto" w:fill="FFFFFF"/>
+          <w:lang w:eastAsia="en-GB"/>
+          <w14:ligatures w14:val="none"/>
+        </w:rPr>
+        <w:t>note,</w:t>
+      </w:r>
+      <w:proofErr w:type="gramEnd"/>
+      <w:r>
+        <w:rPr>
+          <w:rFonts w:ascii="Times New Roman" w:eastAsia="Times New Roman" w:hAnsi="Times New Roman" w:cs="Times New Roman"/>
+          <w:color w:val="0070C0"/>
+          <w:kern w:val="0"/>
+          <w:shd w:val="clear" w:color="auto" w:fill="FFFFFF"/>
+          <w:lang w:eastAsia="en-GB"/>
+          <w14:ligatures w14:val="none"/>
+        </w:rPr>
+        <w:t xml:space="preserve"> that in the communications we received following the peer-review of our manuscript there appeared to have been some duplication of the text outlining the Editors feedback for us. Thus, in our response document here, we have endeavored to condense this feedback to allow us to more concisely respond to each of the Editors’ concerns.</w:t>
       </w:r>
     </w:p>
     <w:p>
@@ -679,7 +703,23 @@
           <w:rFonts w:ascii="Times New Roman" w:hAnsi="Times New Roman" w:cs="Times New Roman"/>
           <w:shd w:val="clear" w:color="auto" w:fill="FFFFFF"/>
         </w:rPr>
-        <w:t>Antonelli, A., Kissling, W. D., Flantua, S. G., Bermúdez, M. A., Mulch, A., Muellner-Riehl, A. N., ... &amp; Hoorn, C. (2018). Geological and climatic influences on mountain biodiversity. Nature geoscience, 11(10), 718-725.</w:t>
+        <w:t xml:space="preserve">Antonelli, A., Kissling, W. D., </w:t>
+      </w:r>
+      <w:proofErr w:type="spellStart"/>
+      <w:r>
+        <w:rPr>
+          <w:rFonts w:ascii="Times New Roman" w:hAnsi="Times New Roman" w:cs="Times New Roman"/>
+          <w:shd w:val="clear" w:color="auto" w:fill="FFFFFF"/>
+        </w:rPr>
+        <w:t>Flantua</w:t>
+      </w:r>
+      <w:proofErr w:type="spellEnd"/>
+      <w:r>
+        <w:rPr>
+          <w:rFonts w:ascii="Times New Roman" w:hAnsi="Times New Roman" w:cs="Times New Roman"/>
+          <w:shd w:val="clear" w:color="auto" w:fill="FFFFFF"/>
+        </w:rPr>
+        <w:t>, S. G., Bermúdez, M. A., Mulch, A., Muellner-Riehl, A. N., ... &amp; Hoorn, C. (2018). Geological and climatic influences on mountain biodiversity. Nature geoscience, 11(10), 718-725.</w:t>
       </w:r>
       <w:r>
         <w:rPr>
@@ -687,12 +727,37 @@
         </w:rPr>
         <w:br/>
       </w:r>
-      <w:r>
-        <w:rPr>
-          <w:rFonts w:ascii="Times New Roman" w:hAnsi="Times New Roman" w:cs="Times New Roman"/>
-          <w:shd w:val="clear" w:color="auto" w:fill="FFFFFF"/>
-        </w:rPr>
-        <w:t>Cazzolla Gatti, R. (2016). The fractal nature of the latitudinal biodiversity gradient. Biologia, 71(6), 669-672.</w:t>
+      <w:proofErr w:type="spellStart"/>
+      <w:r>
+        <w:rPr>
+          <w:rFonts w:ascii="Times New Roman" w:hAnsi="Times New Roman" w:cs="Times New Roman"/>
+          <w:shd w:val="clear" w:color="auto" w:fill="FFFFFF"/>
+        </w:rPr>
+        <w:t>Cazzolla</w:t>
+      </w:r>
+      <w:proofErr w:type="spellEnd"/>
+      <w:r>
+        <w:rPr>
+          <w:rFonts w:ascii="Times New Roman" w:hAnsi="Times New Roman" w:cs="Times New Roman"/>
+          <w:shd w:val="clear" w:color="auto" w:fill="FFFFFF"/>
+        </w:rPr>
+        <w:t xml:space="preserve"> Gatti, R. (2016). The fractal nature of the latitudinal biodiversity gradient. </w:t>
+      </w:r>
+      <w:proofErr w:type="spellStart"/>
+      <w:r>
+        <w:rPr>
+          <w:rFonts w:ascii="Times New Roman" w:hAnsi="Times New Roman" w:cs="Times New Roman"/>
+          <w:shd w:val="clear" w:color="auto" w:fill="FFFFFF"/>
+        </w:rPr>
+        <w:t>Biologia</w:t>
+      </w:r>
+      <w:proofErr w:type="spellEnd"/>
+      <w:r>
+        <w:rPr>
+          <w:rFonts w:ascii="Times New Roman" w:hAnsi="Times New Roman" w:cs="Times New Roman"/>
+          <w:shd w:val="clear" w:color="auto" w:fill="FFFFFF"/>
+        </w:rPr>
+        <w:t>, 71(6), 669-672.</w:t>
       </w:r>
       <w:r>
         <w:rPr>
@@ -753,12 +818,37 @@
         </w:rPr>
         <w:br/>
       </w:r>
-      <w:r>
-        <w:rPr>
-          <w:rFonts w:ascii="Times New Roman" w:hAnsi="Times New Roman" w:cs="Times New Roman"/>
-          <w:shd w:val="clear" w:color="auto" w:fill="FFFFFF"/>
-        </w:rPr>
-        <w:t>O'neill, R. V., Milne, B. T., Turner, M. G., &amp; Gardner, R. H. (1988). Resource utilization scales and landscape pattern. Landscape Ecology, 2(1), 63-69.</w:t>
+      <w:proofErr w:type="spellStart"/>
+      <w:r>
+        <w:rPr>
+          <w:rFonts w:ascii="Times New Roman" w:hAnsi="Times New Roman" w:cs="Times New Roman"/>
+          <w:shd w:val="clear" w:color="auto" w:fill="FFFFFF"/>
+        </w:rPr>
+        <w:t>O'neill</w:t>
+      </w:r>
+      <w:proofErr w:type="spellEnd"/>
+      <w:r>
+        <w:rPr>
+          <w:rFonts w:ascii="Times New Roman" w:hAnsi="Times New Roman" w:cs="Times New Roman"/>
+          <w:shd w:val="clear" w:color="auto" w:fill="FFFFFF"/>
+        </w:rPr>
+        <w:t xml:space="preserve">, R. V., Milne, B. T., Turner, M. G., &amp; Gardner, R. H. (1988). Resource utilization scales and landscape </w:t>
+      </w:r>
+      <w:proofErr w:type="gramStart"/>
+      <w:r>
+        <w:rPr>
+          <w:rFonts w:ascii="Times New Roman" w:hAnsi="Times New Roman" w:cs="Times New Roman"/>
+          <w:shd w:val="clear" w:color="auto" w:fill="FFFFFF"/>
+        </w:rPr>
+        <w:t>pattern</w:t>
+      </w:r>
+      <w:proofErr w:type="gramEnd"/>
+      <w:r>
+        <w:rPr>
+          <w:rFonts w:ascii="Times New Roman" w:hAnsi="Times New Roman" w:cs="Times New Roman"/>
+          <w:shd w:val="clear" w:color="auto" w:fill="FFFFFF"/>
+        </w:rPr>
+        <w:t>. Landscape Ecology, 2(1), 63-69.</w:t>
       </w:r>
       <w:r>
         <w:rPr>
@@ -810,7 +900,39 @@
           <w:rFonts w:ascii="Times New Roman" w:hAnsi="Times New Roman" w:cs="Times New Roman"/>
           <w:shd w:val="clear" w:color="auto" w:fill="FFFFFF"/>
         </w:rPr>
-        <w:t>Wiens, J. A., &amp; Milne, B. T. (1989). Scaling of ‘landscapes’ in landscape ecology, or, landscape ecology from a beetle's perspective. Landscape ecology, 3(2), 87-96.</w:t>
+        <w:t>Wiens, J. A., &amp; Milne, B. T. (1989). Scaling of ‘landscapes</w:t>
+      </w:r>
+      <w:proofErr w:type="gramStart"/>
+      <w:r>
+        <w:rPr>
+          <w:rFonts w:ascii="Times New Roman" w:hAnsi="Times New Roman" w:cs="Times New Roman"/>
+          <w:shd w:val="clear" w:color="auto" w:fill="FFFFFF"/>
+        </w:rPr>
+        <w:t>’ in</w:t>
+      </w:r>
+      <w:proofErr w:type="gramEnd"/>
+      <w:r>
+        <w:rPr>
+          <w:rFonts w:ascii="Times New Roman" w:hAnsi="Times New Roman" w:cs="Times New Roman"/>
+          <w:shd w:val="clear" w:color="auto" w:fill="FFFFFF"/>
+        </w:rPr>
+        <w:t xml:space="preserve"> landscape ecology, </w:t>
+      </w:r>
+      <w:proofErr w:type="gramStart"/>
+      <w:r>
+        <w:rPr>
+          <w:rFonts w:ascii="Times New Roman" w:hAnsi="Times New Roman" w:cs="Times New Roman"/>
+          <w:shd w:val="clear" w:color="auto" w:fill="FFFFFF"/>
+        </w:rPr>
+        <w:t>or,</w:t>
+      </w:r>
+      <w:proofErr w:type="gramEnd"/>
+      <w:r>
+        <w:rPr>
+          <w:rFonts w:ascii="Times New Roman" w:hAnsi="Times New Roman" w:cs="Times New Roman"/>
+          <w:shd w:val="clear" w:color="auto" w:fill="FFFFFF"/>
+        </w:rPr>
+        <w:t xml:space="preserve"> landscape ecology from a beetle's perspective. Landscape ecology, 3(2), 87-96.</w:t>
       </w:r>
       <w:r>
         <w:rPr>
@@ -985,11 +1107,19 @@
         </w:rPr>
         <w:t>-</w:t>
       </w:r>
-      <w:r>
-        <w:rPr>
-          <w:rFonts w:ascii="Times New Roman" w:hAnsi="Times New Roman" w:cs="Times New Roman"/>
-        </w:rPr>
-        <w:t xml:space="preserve">Pulliza et al. 2020) to the entire Earth’s surface. Using the GEBCO global terrain model at 1.87 km resolution (~185 million grid cells), they compute three </w:t>
+      <w:proofErr w:type="spellStart"/>
+      <w:r>
+        <w:rPr>
+          <w:rFonts w:ascii="Times New Roman" w:hAnsi="Times New Roman" w:cs="Times New Roman"/>
+        </w:rPr>
+        <w:t>Pulliza</w:t>
+      </w:r>
+      <w:proofErr w:type="spellEnd"/>
+      <w:r>
+        <w:rPr>
+          <w:rFonts w:ascii="Times New Roman" w:hAnsi="Times New Roman" w:cs="Times New Roman"/>
+        </w:rPr>
+        <w:t xml:space="preserve"> et al. 2020) to the entire Earth’s surface. Using the GEBCO global terrain model at 1.87 km resolution (~185 million grid cells), they compute three </w:t>
       </w:r>
       <w:r>
         <w:rPr>
@@ -1015,6 +1145,7 @@
         </w:rPr>
         <w:t>), rugosity (</w:t>
       </w:r>
+      <w:proofErr w:type="gramStart"/>
       <w:r>
         <w:rPr>
           <w:rFonts w:ascii="Cambria Math" w:hAnsi="Cambria Math" w:cs="Cambria Math"/>
@@ -1025,7 +1156,14 @@
         <w:rPr>
           <w:rFonts w:ascii="Times New Roman" w:hAnsi="Times New Roman" w:cs="Times New Roman"/>
         </w:rPr>
-        <w:t>), and fractal dimension (</w:t>
+        <w:t>),</w:t>
+      </w:r>
+      <w:proofErr w:type="gramEnd"/>
+      <w:r>
+        <w:rPr>
+          <w:rFonts w:ascii="Times New Roman" w:hAnsi="Times New Roman" w:cs="Times New Roman"/>
+        </w:rPr>
+        <w:t xml:space="preserve"> and fractal dimension (</w:t>
       </w:r>
       <w:r>
         <w:rPr>
@@ -1119,7 +1257,28 @@
         <w:rPr>
           <w:rFonts w:ascii="Times New Roman" w:hAnsi="Times New Roman" w:cs="Times New Roman"/>
         </w:rPr>
-        <w:t xml:space="preserve">By overlaying IUCN ecosystem functional group (EFG) maps onto their complexity rasters they develop a visualization of the resulting distributions of </w:t>
+        <w:t xml:space="preserve">By overlaying IUCN ecosystem functional group (EFG) maps onto their complexity </w:t>
+      </w:r>
+      <w:proofErr w:type="spellStart"/>
+      <w:r>
+        <w:rPr>
+          <w:rFonts w:ascii="Times New Roman" w:hAnsi="Times New Roman" w:cs="Times New Roman"/>
+        </w:rPr>
+        <w:t>rasters</w:t>
+      </w:r>
+      <w:proofErr w:type="spellEnd"/>
+      <w:r>
+        <w:rPr>
+          <w:rFonts w:ascii="Times New Roman" w:hAnsi="Times New Roman" w:cs="Times New Roman"/>
+        </w:rPr>
+        <w:t xml:space="preserve"> they develop a visualization of the resulting distributions </w:t>
+      </w:r>
+      <w:proofErr w:type="gramStart"/>
+      <w:r>
+        <w:rPr>
+          <w:rFonts w:ascii="Times New Roman" w:hAnsi="Times New Roman" w:cs="Times New Roman"/>
+        </w:rPr>
+        <w:t xml:space="preserve">of </w:t>
       </w:r>
       <w:r>
         <w:rPr>
@@ -1139,6 +1298,7 @@
         </w:rPr>
         <w:t>𝐷</w:t>
       </w:r>
+      <w:proofErr w:type="gramEnd"/>
       <w:r>
         <w:rPr>
           <w:rFonts w:ascii="Times New Roman" w:hAnsi="Times New Roman" w:cs="Times New Roman"/>
@@ -1239,7 +1399,14 @@
         <w:rPr>
           <w:rFonts w:ascii="Times New Roman" w:hAnsi="Times New Roman" w:cs="Times New Roman"/>
         </w:rPr>
-        <w:t xml:space="preserve"> in </w:t>
+        <w:t xml:space="preserve"> </w:t>
+      </w:r>
+      <w:proofErr w:type="gramStart"/>
+      <w:r>
+        <w:rPr>
+          <w:rFonts w:ascii="Times New Roman" w:hAnsi="Times New Roman" w:cs="Times New Roman"/>
+        </w:rPr>
+        <w:t xml:space="preserve">in </w:t>
       </w:r>
       <w:r>
         <w:rPr>
@@ -1259,11 +1426,26 @@
         </w:rPr>
         <w:t>𝐷</w:t>
       </w:r>
-      <w:r>
-        <w:rPr>
-          <w:rFonts w:ascii="Times New Roman" w:hAnsi="Times New Roman" w:cs="Times New Roman"/>
-        </w:rPr>
-        <w:t xml:space="preserve"> distributions across ecosystem types, suggesting that structural complexity alone is not a great discriminant of ecosystem identity. This leaves the reading with the impression of a narrative that cherry-picks instructive examples (salt lakes</w:t>
+      <w:proofErr w:type="gramEnd"/>
+      <w:r>
+        <w:rPr>
+          <w:rFonts w:ascii="Times New Roman" w:hAnsi="Times New Roman" w:cs="Times New Roman"/>
+        </w:rPr>
+        <w:t xml:space="preserve"> distributions across ecosystem types, suggesting that structural complexity alone is not a great discriminant </w:t>
+      </w:r>
+      <w:proofErr w:type="gramStart"/>
+      <w:r>
+        <w:rPr>
+          <w:rFonts w:ascii="Times New Roman" w:hAnsi="Times New Roman" w:cs="Times New Roman"/>
+        </w:rPr>
+        <w:t>of</w:t>
+      </w:r>
+      <w:proofErr w:type="gramEnd"/>
+      <w:r>
+        <w:rPr>
+          <w:rFonts w:ascii="Times New Roman" w:hAnsi="Times New Roman" w:cs="Times New Roman"/>
+        </w:rPr>
+        <w:t xml:space="preserve"> ecosystem identity. This leaves the reading with the impression of a narrative that cherry-picks instructive examples (salt lakes</w:t>
       </w:r>
       <w:r>
         <w:rPr>
@@ -1348,7 +1530,21 @@
         <w:rPr>
           <w:rFonts w:ascii="Times New Roman" w:hAnsi="Times New Roman" w:cs="Times New Roman"/>
         </w:rPr>
-        <w:t>forming processes (e.g., vegetation growth) determine complexity, or whether both are co-determined by a third factor (e.g., climate, geology, tectonic history). The discussion of oceanic temperate rainforests and polar tundra sharing structural signatures but supporting different communities under different climates actually obscures (and perhaps undermines) the claim made by H1 as stated — it shows that structural complexity alone does not determine biotic community composition, which is precisely the opposite of the hypothesis.</w:t>
+        <w:t xml:space="preserve">forming processes (e.g., vegetation growth) determine complexity, or whether both are co-determined by a third factor (e.g., climate, geology, tectonic history). The discussion of oceanic temperate rainforests and polar tundra sharing structural signatures but supporting different communities under different climates </w:t>
+      </w:r>
+      <w:proofErr w:type="gramStart"/>
+      <w:r>
+        <w:rPr>
+          <w:rFonts w:ascii="Times New Roman" w:hAnsi="Times New Roman" w:cs="Times New Roman"/>
+        </w:rPr>
+        <w:t>actually obscures</w:t>
+      </w:r>
+      <w:proofErr w:type="gramEnd"/>
+      <w:r>
+        <w:rPr>
+          <w:rFonts w:ascii="Times New Roman" w:hAnsi="Times New Roman" w:cs="Times New Roman"/>
+        </w:rPr>
+        <w:t xml:space="preserve"> (and perhaps undermines) the claim made by H1 as stated — it shows that structural complexity alone does not determine biotic community composition, which is precisely the opposite of the hypothesis.</w:t>
       </w:r>
     </w:p>
     <w:p>
@@ -1596,7 +1792,21 @@
         <w:rPr>
           <w:rFonts w:ascii="Times New Roman" w:hAnsi="Times New Roman" w:cs="Times New Roman"/>
         </w:rPr>
-        <w:t xml:space="preserve"> seek to test this using two approaches. (i) By comparing </w:t>
+        <w:t xml:space="preserve"> seek to test this using two approaches. (</w:t>
+      </w:r>
+      <w:proofErr w:type="spellStart"/>
+      <w:r>
+        <w:rPr>
+          <w:rFonts w:ascii="Times New Roman" w:hAnsi="Times New Roman" w:cs="Times New Roman"/>
+        </w:rPr>
+        <w:t>i</w:t>
+      </w:r>
+      <w:proofErr w:type="spellEnd"/>
+      <w:r>
+        <w:rPr>
+          <w:rFonts w:ascii="Times New Roman" w:hAnsi="Times New Roman" w:cs="Times New Roman"/>
+        </w:rPr>
+        <w:t xml:space="preserve">) By comparing </w:t>
       </w:r>
       <w:r>
         <w:rPr>
@@ -1756,7 +1966,14 @@
         <w:rPr>
           <w:rFonts w:ascii="Times New Roman" w:hAnsi="Times New Roman" w:cs="Times New Roman"/>
         </w:rPr>
-        <w:t xml:space="preserve">which is more intuitive and aligns with the narrative of humans preferring flatter terrain, but the density results suggest that once an area is settled, its structural complexity does not strongly constrain how densely it can be populated (except for </w:t>
+        <w:t xml:space="preserve">which is more intuitive and aligns with the narrative of humans preferring flatter terrain, but the density results suggest that once an area is settled, its structural complexity does not strongly constrain how densely it can be populated (except </w:t>
+      </w:r>
+      <w:proofErr w:type="gramStart"/>
+      <w:r>
+        <w:rPr>
+          <w:rFonts w:ascii="Times New Roman" w:hAnsi="Times New Roman" w:cs="Times New Roman"/>
+        </w:rPr>
+        <w:t xml:space="preserve">for </w:t>
       </w:r>
       <w:r>
         <w:rPr>
@@ -1764,6 +1981,7 @@
         </w:rPr>
         <w:t>𝐷</w:t>
       </w:r>
+      <w:proofErr w:type="gramEnd"/>
       <w:r>
         <w:rPr>
           <w:rFonts w:ascii="Times New Roman" w:hAnsi="Times New Roman" w:cs="Times New Roman"/>
@@ -1792,7 +2010,49 @@
         <w:rPr>
           <w:rFonts w:ascii="Times New Roman" w:hAnsi="Times New Roman" w:cs="Times New Roman"/>
         </w:rPr>
-        <w:t>More fundamentally, it is very hard to distinguish cause from effect with static layers (and authors acknowledge this). But the framing still leans heavily toward the interpretation that humans select less complex environments, while the alternative — that human modification creates less complex environments (agriculture flattening terrain, urbanization homogenizing surfaces) — receives less analytical attention. Since the DEM incorporates anthropogenic modifications (cities, leveled terrain, drained wetlands), the measured complexity of urban/cropland areas already reflects human modification, making the relationship partially tautological.</w:t>
+        <w:t xml:space="preserve">More fundamentally, it is very hard to distinguish cause from effect with static layers (and authors acknowledge this). But </w:t>
+      </w:r>
+      <w:proofErr w:type="gramStart"/>
+      <w:r>
+        <w:rPr>
+          <w:rFonts w:ascii="Times New Roman" w:hAnsi="Times New Roman" w:cs="Times New Roman"/>
+        </w:rPr>
+        <w:t>the framing</w:t>
+      </w:r>
+      <w:proofErr w:type="gramEnd"/>
+      <w:r>
+        <w:rPr>
+          <w:rFonts w:ascii="Times New Roman" w:hAnsi="Times New Roman" w:cs="Times New Roman"/>
+        </w:rPr>
+        <w:t xml:space="preserve"> still leans heavily toward the interpretation that humans select </w:t>
+      </w:r>
+      <w:proofErr w:type="gramStart"/>
+      <w:r>
+        <w:rPr>
+          <w:rFonts w:ascii="Times New Roman" w:hAnsi="Times New Roman" w:cs="Times New Roman"/>
+        </w:rPr>
+        <w:t>less</w:t>
+      </w:r>
+      <w:proofErr w:type="gramEnd"/>
+      <w:r>
+        <w:rPr>
+          <w:rFonts w:ascii="Times New Roman" w:hAnsi="Times New Roman" w:cs="Times New Roman"/>
+        </w:rPr>
+        <w:t xml:space="preserve"> complex environments, while the alternative — that human modification creates </w:t>
+      </w:r>
+      <w:proofErr w:type="gramStart"/>
+      <w:r>
+        <w:rPr>
+          <w:rFonts w:ascii="Times New Roman" w:hAnsi="Times New Roman" w:cs="Times New Roman"/>
+        </w:rPr>
+        <w:t>less</w:t>
+      </w:r>
+      <w:proofErr w:type="gramEnd"/>
+      <w:r>
+        <w:rPr>
+          <w:rFonts w:ascii="Times New Roman" w:hAnsi="Times New Roman" w:cs="Times New Roman"/>
+        </w:rPr>
+        <w:t xml:space="preserve"> complex environments (agriculture flattening terrain, urbanization homogenizing surfaces) — receives less analytical attention. Since the DEM incorporates anthropogenic modifications (cities, leveled terrain, drained wetlands), the measured complexity of urban/cropland areas already reflects human modification, making the relationship partially tautological.</w:t>
       </w:r>
     </w:p>
     <w:p>
@@ -1908,7 +2168,35 @@
         <w:rPr>
           <w:rFonts w:ascii="Times New Roman" w:hAnsi="Times New Roman" w:cs="Times New Roman"/>
         </w:rPr>
-        <w:t>However, I am not convinced that this case study should be relegated to a box element as it may undermines its impact. The global maps are visually striking but analytically thin (descriptive overlays), whereas the island analysis is genuinely inferential. I may advise authors to reconsider their presentation of this research, for instance, I would consider centering the paper on the island biodiversity analysis and using the global maps a supporting context — but this is personal a stylistic judgment.</w:t>
+        <w:t xml:space="preserve">However, I am not convinced that this case study should be relegated to a box element as it may </w:t>
+      </w:r>
+      <w:proofErr w:type="gramStart"/>
+      <w:r>
+        <w:rPr>
+          <w:rFonts w:ascii="Times New Roman" w:hAnsi="Times New Roman" w:cs="Times New Roman"/>
+        </w:rPr>
+        <w:t>undermines</w:t>
+      </w:r>
+      <w:proofErr w:type="gramEnd"/>
+      <w:r>
+        <w:rPr>
+          <w:rFonts w:ascii="Times New Roman" w:hAnsi="Times New Roman" w:cs="Times New Roman"/>
+        </w:rPr>
+        <w:t xml:space="preserve"> its impact. The global maps are visually striking but analytically thin (descriptive overlays), whereas the island analysis is genuinely inferential. I may advise authors to reconsider their presentation of this research, for instance, I would consider centering the paper on the island biodiversity analysis and using the global maps a supporting context — but this is </w:t>
+      </w:r>
+      <w:proofErr w:type="gramStart"/>
+      <w:r>
+        <w:rPr>
+          <w:rFonts w:ascii="Times New Roman" w:hAnsi="Times New Roman" w:cs="Times New Roman"/>
+        </w:rPr>
+        <w:t>personal</w:t>
+      </w:r>
+      <w:proofErr w:type="gramEnd"/>
+      <w:r>
+        <w:rPr>
+          <w:rFonts w:ascii="Times New Roman" w:hAnsi="Times New Roman" w:cs="Times New Roman"/>
+        </w:rPr>
+        <w:t xml:space="preserve"> a stylistic judgment.</w:t>
       </w:r>
     </w:p>
     <w:p>
@@ -1966,7 +2254,67 @@
           <w:lang w:eastAsia="en-GB"/>
           <w14:ligatures w14:val="none"/>
         </w:rPr>
-        <w:t xml:space="preserve"> Still think the global application is more important due it acting as a confirmation of the proliferation of these geometric patterns across scale.</w:t>
+        <w:t xml:space="preserve"> Still think the global application is more important </w:t>
+      </w:r>
+      <w:proofErr w:type="gramStart"/>
+      <w:r>
+        <w:rPr>
+          <w:rFonts w:ascii="Times New Roman" w:eastAsia="Times New Roman" w:hAnsi="Times New Roman" w:cs="Times New Roman"/>
+          <w:i/>
+          <w:iCs/>
+          <w:color w:val="0070C0"/>
+          <w:kern w:val="0"/>
+          <w:highlight w:val="yellow"/>
+          <w:shd w:val="clear" w:color="auto" w:fill="FFFFFF"/>
+          <w:lang w:eastAsia="en-GB"/>
+          <w14:ligatures w14:val="none"/>
+        </w:rPr>
+        <w:t>due</w:t>
+      </w:r>
+      <w:proofErr w:type="gramEnd"/>
+      <w:r>
+        <w:rPr>
+          <w:rFonts w:ascii="Times New Roman" w:eastAsia="Times New Roman" w:hAnsi="Times New Roman" w:cs="Times New Roman"/>
+          <w:i/>
+          <w:iCs/>
+          <w:color w:val="0070C0"/>
+          <w:kern w:val="0"/>
+          <w:highlight w:val="yellow"/>
+          <w:shd w:val="clear" w:color="auto" w:fill="FFFFFF"/>
+          <w:lang w:eastAsia="en-GB"/>
+          <w14:ligatures w14:val="none"/>
+        </w:rPr>
+        <w:t xml:space="preserve"> </w:t>
+      </w:r>
+      <w:proofErr w:type="gramStart"/>
+      <w:r>
+        <w:rPr>
+          <w:rFonts w:ascii="Times New Roman" w:eastAsia="Times New Roman" w:hAnsi="Times New Roman" w:cs="Times New Roman"/>
+          <w:i/>
+          <w:iCs/>
+          <w:color w:val="0070C0"/>
+          <w:kern w:val="0"/>
+          <w:highlight w:val="yellow"/>
+          <w:shd w:val="clear" w:color="auto" w:fill="FFFFFF"/>
+          <w:lang w:eastAsia="en-GB"/>
+          <w14:ligatures w14:val="none"/>
+        </w:rPr>
+        <w:t>it</w:t>
+      </w:r>
+      <w:proofErr w:type="gramEnd"/>
+      <w:r>
+        <w:rPr>
+          <w:rFonts w:ascii="Times New Roman" w:eastAsia="Times New Roman" w:hAnsi="Times New Roman" w:cs="Times New Roman"/>
+          <w:i/>
+          <w:iCs/>
+          <w:color w:val="0070C0"/>
+          <w:kern w:val="0"/>
+          <w:highlight w:val="yellow"/>
+          <w:shd w:val="clear" w:color="auto" w:fill="FFFFFF"/>
+          <w:lang w:eastAsia="en-GB"/>
+          <w14:ligatures w14:val="none"/>
+        </w:rPr>
+        <w:t xml:space="preserve"> acting as a confirmation of the proliferation of these geometric patterns across scale.</w:t>
       </w:r>
     </w:p>
     <w:p>
@@ -2034,7 +2382,35 @@
         <w:rPr>
           <w:rFonts w:ascii="Times New Roman" w:hAnsi="Times New Roman" w:cs="Times New Roman"/>
         </w:rPr>
-        <w:t>This is, to me, the most fundamental assumption. The framework was developed for coral reefs at meter-to-centimeter scales (Torres-Pulliza et al. 2020) and forest canopies (Ehbrecht et al. 2021). Applying it at 1.87 km resolution means the “structural complexity” being measured is topographic relief at landscape scale — it captures mountain ranges, valleys, and canyons, but not the fine-grained habitat structure that directly mediates organismal resource use. The ecological literature on structural complexity and biodiversity typically operates at scales 2–4 orders of magnitude finer than what is measured here. The scale sensitivity analysis (Fig. S3) shows that fractal dimension becomes unreliable below ~935 m, which means the chosen scale is near the lower bound of what is feasible, not an ecologically motivated choice. The authors are upfront about this in the Supplementary Materials but don’t discuss in the main text what ecological processes actually operate at 1.87 km resolution, versus what processes operate at the scales where structural complexity has been shown to matter for organisms.</w:t>
+        <w:t>This is, to me, the most fundamental assumption. The framework was developed for coral reefs at meter-to-centimeter scales (Torres-</w:t>
+      </w:r>
+      <w:proofErr w:type="spellStart"/>
+      <w:r>
+        <w:rPr>
+          <w:rFonts w:ascii="Times New Roman" w:hAnsi="Times New Roman" w:cs="Times New Roman"/>
+        </w:rPr>
+        <w:t>Pulliza</w:t>
+      </w:r>
+      <w:proofErr w:type="spellEnd"/>
+      <w:r>
+        <w:rPr>
+          <w:rFonts w:ascii="Times New Roman" w:hAnsi="Times New Roman" w:cs="Times New Roman"/>
+        </w:rPr>
+        <w:t xml:space="preserve"> et al. 2020) and forest canopies (Ehbrecht et al. 2021). Applying it at 1.87 km resolution means the “structural complexity” being measured is topographic relief at landscape scale — it captures mountain ranges, valleys, and canyons, but not the fine-grained habitat structure that directly mediates organismal resource use. The ecological literature on structural complexity and biodiversity typically operates at scales 2–4 orders of magnitude finer than what is measured here. The scale sensitivity analysis (Fig. S3) shows that fractal dimension becomes unreliable below ~935 m, which means the chosen scale is near the lower bound of what is feasible, not an ecologically motivated choice. The authors are upfront about this in the Supplementary Materials but don’t discuss in the main text what ecological processes </w:t>
+      </w:r>
+      <w:proofErr w:type="gramStart"/>
+      <w:r>
+        <w:rPr>
+          <w:rFonts w:ascii="Times New Roman" w:hAnsi="Times New Roman" w:cs="Times New Roman"/>
+        </w:rPr>
+        <w:t>actually operate</w:t>
+      </w:r>
+      <w:proofErr w:type="gramEnd"/>
+      <w:r>
+        <w:rPr>
+          <w:rFonts w:ascii="Times New Roman" w:hAnsi="Times New Roman" w:cs="Times New Roman"/>
+        </w:rPr>
+        <w:t xml:space="preserve"> at 1.87 km resolution, versus what processes operate at the scales where structural complexity has been shown to matter for organisms.</w:t>
       </w:r>
     </w:p>
     <w:p>
@@ -2080,8 +2456,9 @@
           <w:lang w:eastAsia="en-GB"/>
           <w14:ligatures w14:val="none"/>
         </w:rPr>
-        <w:t xml:space="preserve">This requires greater discussion in the main text to justify the decision, but to also highlight that as well as providing products at this global scale our approach here demonstrates that the </w:t>
-      </w:r>
+        <w:t xml:space="preserve">This requires greater discussion in the main text to justify the decision, but to also highlight that as well as providing products at this global scale our approach here demonstrates that </w:t>
+      </w:r>
+      <w:proofErr w:type="gramStart"/>
       <w:r>
         <w:rPr>
           <w:rFonts w:ascii="Times New Roman" w:eastAsia="Times New Roman" w:hAnsi="Times New Roman" w:cs="Times New Roman"/>
@@ -2094,8 +2471,37 @@
           <w:lang w:eastAsia="en-GB"/>
           <w14:ligatures w14:val="none"/>
         </w:rPr>
+        <w:t xml:space="preserve">the </w:t>
+      </w:r>
+      <w:r>
+        <w:rPr>
+          <w:rFonts w:ascii="Times New Roman" w:eastAsia="Times New Roman" w:hAnsi="Times New Roman" w:cs="Times New Roman"/>
+          <w:i/>
+          <w:iCs/>
+          <w:color w:val="0070C0"/>
+          <w:kern w:val="0"/>
+          <w:highlight w:val="yellow"/>
+          <w:shd w:val="clear" w:color="auto" w:fill="FFFFFF"/>
+          <w:lang w:eastAsia="en-GB"/>
+          <w14:ligatures w14:val="none"/>
+        </w:rPr>
         <w:lastRenderedPageBreak/>
-        <w:t>geometric framework can be implemented across scales and so presents a unifying approach to quantifying complexity.</w:t>
+        <w:t>geometric</w:t>
+      </w:r>
+      <w:proofErr w:type="gramEnd"/>
+      <w:r>
+        <w:rPr>
+          <w:rFonts w:ascii="Times New Roman" w:eastAsia="Times New Roman" w:hAnsi="Times New Roman" w:cs="Times New Roman"/>
+          <w:i/>
+          <w:iCs/>
+          <w:color w:val="0070C0"/>
+          <w:kern w:val="0"/>
+          <w:highlight w:val="yellow"/>
+          <w:shd w:val="clear" w:color="auto" w:fill="FFFFFF"/>
+          <w:lang w:eastAsia="en-GB"/>
+          <w14:ligatures w14:val="none"/>
+        </w:rPr>
+        <w:t xml:space="preserve"> framework can be implemented across scales and so presents a unifying approach to quantifying complexity.</w:t>
       </w:r>
     </w:p>
     <w:p>
@@ -2144,7 +2550,21 @@
         <w:rPr>
           <w:rFonts w:ascii="Times New Roman" w:hAnsi="Times New Roman" w:cs="Times New Roman"/>
         </w:rPr>
-        <w:t>The DEM represents bathymetry and topography but not biogenic structure. The structural complexity of a coral reef, a mangrove forest, or an old-growth canopy may be invisible at this resolution. What I believe is measured is geological/geomorphological complexity, not habitat complexity in a deeper ecological sense. The paper sometimes conflates these — for instance, interpreting high fractal dimension in the Amazon Basin as being linked to rainforest biodiversity, when what is actually measured is the fractal dimension of the terrain beneath the forest, not the forest structure itself. This distinction is important because the ecological complexity that mediates species interactions is largely biotic, not geomorphological, at the scales relevant for most organisms.</w:t>
+        <w:t xml:space="preserve">The DEM represents bathymetry and topography but not biogenic structure. The structural complexity of a coral reef, a mangrove forest, or an old-growth canopy may be invisible at this resolution. What I believe is measured is geological/geomorphological complexity, not habitat complexity in a deeper ecological sense. The paper sometimes conflates these — for instance, interpreting high fractal dimension in the Amazon Basin as being linked to rainforest biodiversity, when what is </w:t>
+      </w:r>
+      <w:proofErr w:type="gramStart"/>
+      <w:r>
+        <w:rPr>
+          <w:rFonts w:ascii="Times New Roman" w:hAnsi="Times New Roman" w:cs="Times New Roman"/>
+        </w:rPr>
+        <w:t>actually measured</w:t>
+      </w:r>
+      <w:proofErr w:type="gramEnd"/>
+      <w:r>
+        <w:rPr>
+          <w:rFonts w:ascii="Times New Roman" w:hAnsi="Times New Roman" w:cs="Times New Roman"/>
+        </w:rPr>
+        <w:t xml:space="preserve"> is the fractal dimension of the terrain beneath the forest, not the forest structure itself. This distinction is important because the ecological complexity that mediates species interactions is largely biotic, not geomorphological, at the scales relevant for most organisms.</w:t>
       </w:r>
     </w:p>
     <w:p>
@@ -2231,8 +2651,16 @@
         <w:rPr>
           <w:rFonts w:ascii="Times New Roman" w:hAnsi="Times New Roman" w:cs="Times New Roman"/>
         </w:rPr>
-        <w:t>Spatial co-occurrence implies functional relationship</w:t>
-      </w:r>
+        <w:t xml:space="preserve">Spatial co-occurrence implies functional </w:t>
+      </w:r>
+      <w:proofErr w:type="gramStart"/>
+      <w:r>
+        <w:rPr>
+          <w:rFonts w:ascii="Times New Roman" w:hAnsi="Times New Roman" w:cs="Times New Roman"/>
+        </w:rPr>
+        <w:t>relationship</w:t>
+      </w:r>
+      <w:proofErr w:type="gramEnd"/>
       <w:r>
         <w:rPr>
           <w:rFonts w:ascii="Times New Roman" w:hAnsi="Times New Roman" w:cs="Times New Roman"/>
@@ -2252,7 +2680,21 @@
         <w:rPr>
           <w:rFonts w:ascii="Times New Roman" w:hAnsi="Times New Roman" w:cs="Times New Roman"/>
         </w:rPr>
-        <w:t>The analyses rely on overlaying complexity rasters onto ecosystem, land cover, and population density layers and interpreting correlations as indicative of structural complexity “shaping” or “delineating” ecosystems and human distributions. But spatial co-occurrence at global scale can reflect shared underlying drivers (climate, tectonic history, glacial history) rather than direct causal relationships. For example, high fractal dimension in the Amazon may reflect fluvial geomorphology rather than functional processes linked to rainforest ecology. The paper acknowledges confounders in places but the causal language in the title (“shapes”) and throughout the text is stronger than what the descriptive analyses support.</w:t>
+        <w:t xml:space="preserve">The analyses rely on overlaying complexity </w:t>
+      </w:r>
+      <w:proofErr w:type="spellStart"/>
+      <w:r>
+        <w:rPr>
+          <w:rFonts w:ascii="Times New Roman" w:hAnsi="Times New Roman" w:cs="Times New Roman"/>
+        </w:rPr>
+        <w:t>rasters</w:t>
+      </w:r>
+      <w:proofErr w:type="spellEnd"/>
+      <w:r>
+        <w:rPr>
+          <w:rFonts w:ascii="Times New Roman" w:hAnsi="Times New Roman" w:cs="Times New Roman"/>
+        </w:rPr>
+        <w:t xml:space="preserve"> onto ecosystem, land cover, and population density layers and interpreting correlations as indicative of structural complexity “shaping” or “delineating” ecosystems and human distributions. But spatial co-occurrence at global scale can reflect shared underlying drivers (climate, tectonic history, glacial history) rather than direct causal relationships. For example, high fractal dimension in the Amazon may reflect fluvial geomorphology rather than functional processes linked to rainforest ecology. The paper acknowledges confounders in places but the causal language in the title (“shapes”) and throughout the text is stronger than what the descriptive analyses support.</w:t>
       </w:r>
     </w:p>
     <w:p>
@@ -2355,7 +2797,21 @@
         <w:rPr>
           <w:rFonts w:ascii="Times New Roman" w:hAnsi="Times New Roman" w:cs="Times New Roman"/>
         </w:rPr>
-        <w:t xml:space="preserve">If I remember correctly, some IUCN EFGs are actually partly defined by their structural characteristics (e.g., “hummock savannas” are named for their structure). Testing whether ecosystems classified partly by structure exhibit similar structural complexity is at least partially circular. This needs to be acknowledged to </w:t>
+        <w:t xml:space="preserve">If I remember correctly, some IUCN EFGs are </w:t>
+      </w:r>
+      <w:proofErr w:type="gramStart"/>
+      <w:r>
+        <w:rPr>
+          <w:rFonts w:ascii="Times New Roman" w:hAnsi="Times New Roman" w:cs="Times New Roman"/>
+        </w:rPr>
+        <w:t>actually partly</w:t>
+      </w:r>
+      <w:proofErr w:type="gramEnd"/>
+      <w:r>
+        <w:rPr>
+          <w:rFonts w:ascii="Times New Roman" w:hAnsi="Times New Roman" w:cs="Times New Roman"/>
+        </w:rPr>
+        <w:t xml:space="preserve"> defined by their structural characteristics (e.g., “hummock savannas” are named for their structure). Testing whether ecosystems classified partly by structure exhibit similar structural complexity is at least partially circular. This needs to be acknowledged to </w:t>
       </w:r>
       <w:r>
         <w:rPr>
@@ -2444,7 +2900,39 @@
           <w:lang w:eastAsia="en-GB"/>
           <w14:ligatures w14:val="none"/>
         </w:rPr>
-        <w:t>Hummock savannas are named due to their biotic structure – hummock plants. Geomorphological environmental attributes feature as a indirect drivers of resource access mediators.</w:t>
+        <w:t xml:space="preserve">Hummock savannas are named due to their biotic structure – hummock plants. Geomorphological environmental attributes feature as </w:t>
+      </w:r>
+      <w:proofErr w:type="spellStart"/>
+      <w:proofErr w:type="gramStart"/>
+      <w:r>
+        <w:rPr>
+          <w:rFonts w:ascii="Times New Roman" w:eastAsia="Times New Roman" w:hAnsi="Times New Roman" w:cs="Times New Roman"/>
+          <w:i/>
+          <w:iCs/>
+          <w:color w:val="0070C0"/>
+          <w:kern w:val="0"/>
+          <w:highlight w:val="yellow"/>
+          <w:shd w:val="clear" w:color="auto" w:fill="FFFFFF"/>
+          <w:lang w:eastAsia="en-GB"/>
+          <w14:ligatures w14:val="none"/>
+        </w:rPr>
+        <w:t>a</w:t>
+      </w:r>
+      <w:proofErr w:type="spellEnd"/>
+      <w:proofErr w:type="gramEnd"/>
+      <w:r>
+        <w:rPr>
+          <w:rFonts w:ascii="Times New Roman" w:eastAsia="Times New Roman" w:hAnsi="Times New Roman" w:cs="Times New Roman"/>
+          <w:i/>
+          <w:iCs/>
+          <w:color w:val="0070C0"/>
+          <w:kern w:val="0"/>
+          <w:highlight w:val="yellow"/>
+          <w:shd w:val="clear" w:color="auto" w:fill="FFFFFF"/>
+          <w:lang w:eastAsia="en-GB"/>
+          <w14:ligatures w14:val="none"/>
+        </w:rPr>
+        <w:t xml:space="preserve"> indirect drivers of resource access mediators.</w:t>
       </w:r>
     </w:p>
     <w:p>
@@ -2651,6 +3139,7 @@
         </w:rPr>
         <w:t xml:space="preserve"> = 0.883; </w:t>
       </w:r>
+      <w:proofErr w:type="gramStart"/>
       <w:r>
         <w:rPr>
           <w:rFonts w:ascii="Cambria Math" w:hAnsi="Cambria Math" w:cs="Cambria Math"/>
@@ -2661,8 +3150,16 @@
         <w:rPr>
           <w:rFonts w:ascii="Times New Roman" w:hAnsi="Times New Roman" w:cs="Times New Roman"/>
         </w:rPr>
-        <w:t xml:space="preserve"> = 0.805; </w:t>
-      </w:r>
+        <w:t xml:space="preserve"> = 0.805</w:t>
+      </w:r>
+      <w:proofErr w:type="gramEnd"/>
+      <w:r>
+        <w:rPr>
+          <w:rFonts w:ascii="Times New Roman" w:hAnsi="Times New Roman" w:cs="Times New Roman"/>
+        </w:rPr>
+        <w:t xml:space="preserve">; </w:t>
+      </w:r>
+      <w:proofErr w:type="gramStart"/>
       <w:r>
         <w:rPr>
           <w:rFonts w:ascii="Cambria Math" w:hAnsi="Cambria Math" w:cs="Cambria Math"/>
@@ -2673,7 +3170,14 @@
         <w:rPr>
           <w:rFonts w:ascii="Times New Roman" w:hAnsi="Times New Roman" w:cs="Times New Roman"/>
         </w:rPr>
-        <w:t xml:space="preserve"> = 0.476). Each subsample is essentially spatially non-independent, and the spatial smoothing term may not fully capture autocorrelation structure. The reported </w:t>
+        <w:t xml:space="preserve"> = 0.476</w:t>
+      </w:r>
+      <w:proofErr w:type="gramEnd"/>
+      <w:r>
+        <w:rPr>
+          <w:rFonts w:ascii="Times New Roman" w:hAnsi="Times New Roman" w:cs="Times New Roman"/>
+        </w:rPr>
+        <w:t xml:space="preserve">). Each subsample is essentially spatially non-independent, and the spatial smoothing term may not fully capture autocorrelation structure. The reported </w:t>
       </w:r>
       <w:r>
         <w:rPr>
@@ -2707,12 +3211,12 @@
           <w:iCs/>
         </w:rPr>
       </w:pPr>
-      <w:commentRangeStart w:id="0"/>
-      <w:r>
-        <w:rPr>
-          <w:rFonts w:ascii="Times New Roman" w:eastAsia="Times New Roman" w:hAnsi="Times New Roman" w:cs="Times New Roman"/>
-          <w:color w:val="0070C0"/>
-          <w:kern w:val="0"/>
+      <w:r>
+        <w:rPr>
+          <w:rFonts w:ascii="Times New Roman" w:eastAsia="Times New Roman" w:hAnsi="Times New Roman" w:cs="Times New Roman"/>
+          <w:color w:val="0070C0"/>
+          <w:kern w:val="0"/>
+          <w:highlight w:val="yellow"/>
           <w:shd w:val="clear" w:color="auto" w:fill="FFFFFF"/>
           <w:lang w:eastAsia="en-GB"/>
           <w14:ligatures w14:val="none"/>
@@ -2724,36 +3228,26 @@
           <w:rFonts w:ascii="Times New Roman" w:eastAsia="Times New Roman" w:hAnsi="Times New Roman" w:cs="Times New Roman"/>
           <w:color w:val="0070C0"/>
           <w:kern w:val="0"/>
-          <w:shd w:val="clear" w:color="auto" w:fill="FFFFFF"/>
-          <w:lang w:eastAsia="en-GB"/>
-          <w14:ligatures w14:val="none"/>
-        </w:rPr>
-        <w:t xml:space="preserve"> </w:t>
-      </w:r>
-      <w:r>
-        <w:rPr>
-          <w:rFonts w:ascii="Times New Roman" w:eastAsia="Times New Roman" w:hAnsi="Times New Roman" w:cs="Times New Roman"/>
-          <w:i/>
-          <w:iCs/>
-          <w:color w:val="0070C0"/>
-          <w:kern w:val="0"/>
+          <w:highlight w:val="yellow"/>
+          <w:shd w:val="clear" w:color="auto" w:fill="FFFFFF"/>
+          <w:lang w:eastAsia="en-GB"/>
+          <w14:ligatures w14:val="none"/>
+        </w:rPr>
+        <w:t xml:space="preserve"> </w:t>
+      </w:r>
+      <w:r>
+        <w:rPr>
+          <w:rFonts w:ascii="Times New Roman" w:eastAsia="Times New Roman" w:hAnsi="Times New Roman" w:cs="Times New Roman"/>
+          <w:i/>
+          <w:iCs/>
+          <w:color w:val="0070C0"/>
+          <w:kern w:val="0"/>
+          <w:highlight w:val="yellow"/>
           <w:shd w:val="clear" w:color="auto" w:fill="FFFFFF"/>
           <w:lang w:eastAsia="en-GB"/>
           <w14:ligatures w14:val="none"/>
         </w:rPr>
         <w:t>This assumption requires greater acknowledgement in the main text as part of presenting the model outputs.</w:t>
-      </w:r>
-      <w:commentRangeEnd w:id="0"/>
-      <w:r>
-        <w:rPr>
-          <w:rStyle w:val="CommentReference"/>
-          <w:rFonts w:ascii="Times New Roman" w:hAnsi="Times New Roman" w:cs="Times New Roman"/>
-          <w:i/>
-          <w:iCs/>
-          <w:sz w:val="24"/>
-          <w:szCs w:val="24"/>
-        </w:rPr>
-        <w:commentReference w:id="0"/>
       </w:r>
     </w:p>
     <w:p>
@@ -2855,7 +3349,21 @@
         <w:rPr>
           <w:rFonts w:ascii="Times New Roman" w:hAnsi="Times New Roman" w:cs="Times New Roman"/>
         </w:rPr>
-        <w:t>whether structural complexity actually discriminates among ecosystems. The ridgeline</w:t>
+        <w:t xml:space="preserve">whether structural complexity </w:t>
+      </w:r>
+      <w:proofErr w:type="gramStart"/>
+      <w:r>
+        <w:rPr>
+          <w:rFonts w:ascii="Times New Roman" w:hAnsi="Times New Roman" w:cs="Times New Roman"/>
+        </w:rPr>
+        <w:t>actually discriminates</w:t>
+      </w:r>
+      <w:proofErr w:type="gramEnd"/>
+      <w:r>
+        <w:rPr>
+          <w:rFonts w:ascii="Times New Roman" w:hAnsi="Times New Roman" w:cs="Times New Roman"/>
+        </w:rPr>
+        <w:t xml:space="preserve"> among ecosystems. The ridgeline</w:t>
       </w:r>
       <w:r>
         <w:rPr>
@@ -3611,7 +4119,67 @@
           <w:lang w:eastAsia="en-GB"/>
           <w14:ligatures w14:val="none"/>
         </w:rPr>
-        <w:t>Be more explicit with the discussion of the data transformation and how it affect the insights provided by the modelling exercise.</w:t>
+        <w:t xml:space="preserve">Be more explicit with the discussion of </w:t>
+      </w:r>
+      <w:proofErr w:type="gramStart"/>
+      <w:r>
+        <w:rPr>
+          <w:rFonts w:ascii="Times New Roman" w:eastAsia="Times New Roman" w:hAnsi="Times New Roman" w:cs="Times New Roman"/>
+          <w:i/>
+          <w:iCs/>
+          <w:color w:val="0070C0"/>
+          <w:kern w:val="0"/>
+          <w:highlight w:val="yellow"/>
+          <w:shd w:val="clear" w:color="auto" w:fill="FFFFFF"/>
+          <w:lang w:eastAsia="en-GB"/>
+          <w14:ligatures w14:val="none"/>
+        </w:rPr>
+        <w:t>the data</w:t>
+      </w:r>
+      <w:proofErr w:type="gramEnd"/>
+      <w:r>
+        <w:rPr>
+          <w:rFonts w:ascii="Times New Roman" w:eastAsia="Times New Roman" w:hAnsi="Times New Roman" w:cs="Times New Roman"/>
+          <w:i/>
+          <w:iCs/>
+          <w:color w:val="0070C0"/>
+          <w:kern w:val="0"/>
+          <w:highlight w:val="yellow"/>
+          <w:shd w:val="clear" w:color="auto" w:fill="FFFFFF"/>
+          <w:lang w:eastAsia="en-GB"/>
+          <w14:ligatures w14:val="none"/>
+        </w:rPr>
+        <w:t xml:space="preserve"> transformation and how it </w:t>
+      </w:r>
+      <w:proofErr w:type="gramStart"/>
+      <w:r>
+        <w:rPr>
+          <w:rFonts w:ascii="Times New Roman" w:eastAsia="Times New Roman" w:hAnsi="Times New Roman" w:cs="Times New Roman"/>
+          <w:i/>
+          <w:iCs/>
+          <w:color w:val="0070C0"/>
+          <w:kern w:val="0"/>
+          <w:highlight w:val="yellow"/>
+          <w:shd w:val="clear" w:color="auto" w:fill="FFFFFF"/>
+          <w:lang w:eastAsia="en-GB"/>
+          <w14:ligatures w14:val="none"/>
+        </w:rPr>
+        <w:t>affect</w:t>
+      </w:r>
+      <w:proofErr w:type="gramEnd"/>
+      <w:r>
+        <w:rPr>
+          <w:rFonts w:ascii="Times New Roman" w:eastAsia="Times New Roman" w:hAnsi="Times New Roman" w:cs="Times New Roman"/>
+          <w:i/>
+          <w:iCs/>
+          <w:color w:val="0070C0"/>
+          <w:kern w:val="0"/>
+          <w:highlight w:val="yellow"/>
+          <w:shd w:val="clear" w:color="auto" w:fill="FFFFFF"/>
+          <w:lang w:eastAsia="en-GB"/>
+          <w14:ligatures w14:val="none"/>
+        </w:rPr>
+        <w:t xml:space="preserve"> the insights provided by the modelling exercise.</w:t>
       </w:r>
     </w:p>
     <w:p>
@@ -3953,7 +4521,21 @@
         <w:rPr>
           <w:rFonts w:ascii="Times New Roman" w:hAnsi="Times New Roman" w:cs="Times New Roman"/>
         </w:rPr>
-        <w:t>and theoretical in nature. These limitations require attention in order to ensure the study's</w:t>
+        <w:t xml:space="preserve">and theoretical in nature. These limitations require attention </w:t>
+      </w:r>
+      <w:proofErr w:type="gramStart"/>
+      <w:r>
+        <w:rPr>
+          <w:rFonts w:ascii="Times New Roman" w:hAnsi="Times New Roman" w:cs="Times New Roman"/>
+        </w:rPr>
+        <w:t>in order to</w:t>
+      </w:r>
+      <w:proofErr w:type="gramEnd"/>
+      <w:r>
+        <w:rPr>
+          <w:rFonts w:ascii="Times New Roman" w:hAnsi="Times New Roman" w:cs="Times New Roman"/>
+        </w:rPr>
+        <w:t xml:space="preserve"> ensure the study's</w:t>
       </w:r>
       <w:r>
         <w:rPr>
@@ -4440,20 +5022,104 @@
           <w:lang w:eastAsia="en-GB"/>
           <w14:ligatures w14:val="none"/>
         </w:rPr>
-        <w:t xml:space="preserve"> concern will in part be addressed by the introduction of more statistical inference (see R6 &amp; R7). The restructuring of the manuscript to being the case study more central will also required careful text edits to better link the expectations with observations. A more explicit indication of what patterns are expect and why is required – link to the editors concerns of how fractal dimension can have disparate effects on diversity.</w:t>
-      </w:r>
-      <w:r>
-        <w:rPr>
-          <w:rFonts w:ascii="Times New Roman" w:eastAsia="Times New Roman" w:hAnsi="Times New Roman" w:cs="Times New Roman"/>
-          <w:i/>
-          <w:iCs/>
-          <w:color w:val="0070C0"/>
-          <w:kern w:val="0"/>
-          <w:shd w:val="clear" w:color="auto" w:fill="FFFFFF"/>
-          <w:lang w:eastAsia="en-GB"/>
-          <w14:ligatures w14:val="none"/>
-        </w:rPr>
-        <w:t xml:space="preserve"> Find away to address a more consistent narrative across all facets of the analysis – how complexity modulates life on the planet.</w:t>
+        <w:t xml:space="preserve"> concern will in part be addressed by the introduction of more statistical inference (see R6 &amp; R7). The restructuring of the manuscript to being the case study more central will also </w:t>
+      </w:r>
+      <w:proofErr w:type="spellStart"/>
+      <w:r>
+        <w:rPr>
+          <w:rFonts w:ascii="Times New Roman" w:eastAsia="Times New Roman" w:hAnsi="Times New Roman" w:cs="Times New Roman"/>
+          <w:i/>
+          <w:iCs/>
+          <w:color w:val="0070C0"/>
+          <w:kern w:val="0"/>
+          <w:shd w:val="clear" w:color="auto" w:fill="FFFFFF"/>
+          <w:lang w:eastAsia="en-GB"/>
+          <w14:ligatures w14:val="none"/>
+        </w:rPr>
+        <w:t>required</w:t>
+      </w:r>
+      <w:proofErr w:type="spellEnd"/>
+      <w:r>
+        <w:rPr>
+          <w:rFonts w:ascii="Times New Roman" w:eastAsia="Times New Roman" w:hAnsi="Times New Roman" w:cs="Times New Roman"/>
+          <w:i/>
+          <w:iCs/>
+          <w:color w:val="0070C0"/>
+          <w:kern w:val="0"/>
+          <w:shd w:val="clear" w:color="auto" w:fill="FFFFFF"/>
+          <w:lang w:eastAsia="en-GB"/>
+          <w14:ligatures w14:val="none"/>
+        </w:rPr>
+        <w:t xml:space="preserve"> careful text edits to better link the expectations with observations. A more explicit indication of what patterns are </w:t>
+      </w:r>
+      <w:proofErr w:type="gramStart"/>
+      <w:r>
+        <w:rPr>
+          <w:rFonts w:ascii="Times New Roman" w:eastAsia="Times New Roman" w:hAnsi="Times New Roman" w:cs="Times New Roman"/>
+          <w:i/>
+          <w:iCs/>
+          <w:color w:val="0070C0"/>
+          <w:kern w:val="0"/>
+          <w:shd w:val="clear" w:color="auto" w:fill="FFFFFF"/>
+          <w:lang w:eastAsia="en-GB"/>
+          <w14:ligatures w14:val="none"/>
+        </w:rPr>
+        <w:t>expect</w:t>
+      </w:r>
+      <w:proofErr w:type="gramEnd"/>
+      <w:r>
+        <w:rPr>
+          <w:rFonts w:ascii="Times New Roman" w:eastAsia="Times New Roman" w:hAnsi="Times New Roman" w:cs="Times New Roman"/>
+          <w:i/>
+          <w:iCs/>
+          <w:color w:val="0070C0"/>
+          <w:kern w:val="0"/>
+          <w:shd w:val="clear" w:color="auto" w:fill="FFFFFF"/>
+          <w:lang w:eastAsia="en-GB"/>
+          <w14:ligatures w14:val="none"/>
+        </w:rPr>
+        <w:t xml:space="preserve"> and why is required – link to the editors concerns of how fractal dimension can have disparate effects on diversity.</w:t>
+      </w:r>
+      <w:r>
+        <w:rPr>
+          <w:rFonts w:ascii="Times New Roman" w:eastAsia="Times New Roman" w:hAnsi="Times New Roman" w:cs="Times New Roman"/>
+          <w:i/>
+          <w:iCs/>
+          <w:color w:val="0070C0"/>
+          <w:kern w:val="0"/>
+          <w:shd w:val="clear" w:color="auto" w:fill="FFFFFF"/>
+          <w:lang w:eastAsia="en-GB"/>
+          <w14:ligatures w14:val="none"/>
+        </w:rPr>
+        <w:t xml:space="preserve"> Find </w:t>
+      </w:r>
+      <w:proofErr w:type="spellStart"/>
+      <w:r>
+        <w:rPr>
+          <w:rFonts w:ascii="Times New Roman" w:eastAsia="Times New Roman" w:hAnsi="Times New Roman" w:cs="Times New Roman"/>
+          <w:i/>
+          <w:iCs/>
+          <w:color w:val="0070C0"/>
+          <w:kern w:val="0"/>
+          <w:shd w:val="clear" w:color="auto" w:fill="FFFFFF"/>
+          <w:lang w:eastAsia="en-GB"/>
+          <w14:ligatures w14:val="none"/>
+        </w:rPr>
+        <w:t>away</w:t>
+      </w:r>
+      <w:proofErr w:type="spellEnd"/>
+      <w:r>
+        <w:rPr>
+          <w:rFonts w:ascii="Times New Roman" w:eastAsia="Times New Roman" w:hAnsi="Times New Roman" w:cs="Times New Roman"/>
+          <w:i/>
+          <w:iCs/>
+          <w:color w:val="0070C0"/>
+          <w:kern w:val="0"/>
+          <w:shd w:val="clear" w:color="auto" w:fill="FFFFFF"/>
+          <w:lang w:eastAsia="en-GB"/>
+          <w14:ligatures w14:val="none"/>
+        </w:rPr>
+        <w:t xml:space="preserve"> to address a more consistent narrative across all facets of the analysis – how complexity modulates life on the planet.</w:t>
       </w:r>
     </w:p>
     <w:p>
@@ -4687,7 +5353,79 @@
           <w:lang w:eastAsia="en-GB"/>
           <w14:ligatures w14:val="none"/>
         </w:rPr>
-        <w:t>L. dos Anjos, H. R. Medeiros, E. V. Lopes, R. D. Holt, M. M. Tavares, H. S. Oliveira, Landscape composition and configuration drive bird richness, abundance, and functional diversity in Neotropical forest fragments. Biodivers. Conserv. 34, 4693–4713 (2025).</w:t>
+        <w:t>L. dos Anjos, H. R. Medeiros, E. V. Lopes, R. D. Holt</w:t>
+      </w:r>
+      <w:proofErr w:type="gramStart"/>
+      <w:r>
+        <w:rPr>
+          <w:rFonts w:ascii="Times New Roman" w:eastAsia="Times New Roman" w:hAnsi="Times New Roman" w:cs="Times New Roman"/>
+          <w:color w:val="0070C0"/>
+          <w:kern w:val="0"/>
+          <w:shd w:val="clear" w:color="auto" w:fill="FFFFFF"/>
+          <w:lang w:eastAsia="en-GB"/>
+          <w14:ligatures w14:val="none"/>
+        </w:rPr>
+        <w:t>, M.</w:t>
+      </w:r>
+      <w:proofErr w:type="gramEnd"/>
+      <w:r>
+        <w:rPr>
+          <w:rFonts w:ascii="Times New Roman" w:eastAsia="Times New Roman" w:hAnsi="Times New Roman" w:cs="Times New Roman"/>
+          <w:color w:val="0070C0"/>
+          <w:kern w:val="0"/>
+          <w:shd w:val="clear" w:color="auto" w:fill="FFFFFF"/>
+          <w:lang w:eastAsia="en-GB"/>
+          <w14:ligatures w14:val="none"/>
+        </w:rPr>
+        <w:t xml:space="preserve"> M. Tavares, H. S. Oliveira, Landscape composition and configuration drive bird richness, abundance, and functional diversity in Neotropical forest fragments. </w:t>
+      </w:r>
+      <w:proofErr w:type="spellStart"/>
+      <w:r>
+        <w:rPr>
+          <w:rFonts w:ascii="Times New Roman" w:eastAsia="Times New Roman" w:hAnsi="Times New Roman" w:cs="Times New Roman"/>
+          <w:color w:val="0070C0"/>
+          <w:kern w:val="0"/>
+          <w:shd w:val="clear" w:color="auto" w:fill="FFFFFF"/>
+          <w:lang w:eastAsia="en-GB"/>
+          <w14:ligatures w14:val="none"/>
+        </w:rPr>
+        <w:t>Biodivers</w:t>
+      </w:r>
+      <w:proofErr w:type="spellEnd"/>
+      <w:r>
+        <w:rPr>
+          <w:rFonts w:ascii="Times New Roman" w:eastAsia="Times New Roman" w:hAnsi="Times New Roman" w:cs="Times New Roman"/>
+          <w:color w:val="0070C0"/>
+          <w:kern w:val="0"/>
+          <w:shd w:val="clear" w:color="auto" w:fill="FFFFFF"/>
+          <w:lang w:eastAsia="en-GB"/>
+          <w14:ligatures w14:val="none"/>
+        </w:rPr>
+        <w:t xml:space="preserve">. </w:t>
+      </w:r>
+      <w:proofErr w:type="spellStart"/>
+      <w:r>
+        <w:rPr>
+          <w:rFonts w:ascii="Times New Roman" w:eastAsia="Times New Roman" w:hAnsi="Times New Roman" w:cs="Times New Roman"/>
+          <w:color w:val="0070C0"/>
+          <w:kern w:val="0"/>
+          <w:shd w:val="clear" w:color="auto" w:fill="FFFFFF"/>
+          <w:lang w:eastAsia="en-GB"/>
+          <w14:ligatures w14:val="none"/>
+        </w:rPr>
+        <w:t>Conserv</w:t>
+      </w:r>
+      <w:proofErr w:type="spellEnd"/>
+      <w:r>
+        <w:rPr>
+          <w:rFonts w:ascii="Times New Roman" w:eastAsia="Times New Roman" w:hAnsi="Times New Roman" w:cs="Times New Roman"/>
+          <w:color w:val="0070C0"/>
+          <w:kern w:val="0"/>
+          <w:shd w:val="clear" w:color="auto" w:fill="FFFFFF"/>
+          <w:lang w:eastAsia="en-GB"/>
+          <w14:ligatures w14:val="none"/>
+        </w:rPr>
+        <w:t>. 34, 4693–4713 (2025).</w:t>
       </w:r>
     </w:p>
     <w:p>
@@ -4912,7 +5650,31 @@
           <w:lang w:eastAsia="en-GB"/>
           <w14:ligatures w14:val="none"/>
         </w:rPr>
-        <w:t>evaluating our reprojection approach allowed us to confirm that we had not introduced any interpolation errors at this early stage of our data extraction. Indeed, the 15 arc-second resolution of the raw global terrain map that we used as the basis for estimating our complexity indices equates to a resolution of approximately 500 m, but only at the equator. As originally described in our methods, it appeared that we had</w:t>
+        <w:t xml:space="preserve">evaluating our reprojection approach allowed us to confirm that we had not introduced any interpolation errors at this early stage of our data extraction. Indeed, the 15 arc-second </w:t>
+      </w:r>
+      <w:proofErr w:type="gramStart"/>
+      <w:r>
+        <w:rPr>
+          <w:rFonts w:ascii="Times New Roman" w:eastAsia="Times New Roman" w:hAnsi="Times New Roman" w:cs="Times New Roman"/>
+          <w:color w:val="0070C0"/>
+          <w:kern w:val="0"/>
+          <w:shd w:val="clear" w:color="auto" w:fill="FFFFFF"/>
+          <w:lang w:eastAsia="en-GB"/>
+          <w14:ligatures w14:val="none"/>
+        </w:rPr>
+        <w:t>resolution</w:t>
+      </w:r>
+      <w:proofErr w:type="gramEnd"/>
+      <w:r>
+        <w:rPr>
+          <w:rFonts w:ascii="Times New Roman" w:eastAsia="Times New Roman" w:hAnsi="Times New Roman" w:cs="Times New Roman"/>
+          <w:color w:val="0070C0"/>
+          <w:kern w:val="0"/>
+          <w:shd w:val="clear" w:color="auto" w:fill="FFFFFF"/>
+          <w:lang w:eastAsia="en-GB"/>
+          <w14:ligatures w14:val="none"/>
+        </w:rPr>
+        <w:t xml:space="preserve"> of the raw global terrain map that we used as the basis for estimating our complexity indices equates to a resolution of approximately 500 m, but only at the equator. As originally described in our methods, it appeared that we had</w:t>
       </w:r>
       <w:r>
         <w:rPr>
@@ -5174,8 +5936,17 @@
           <w:rFonts w:ascii="Times New Roman" w:hAnsi="Times New Roman" w:cs="Times New Roman"/>
           <w:color w:val="0070C0"/>
         </w:rPr>
-        <w:t xml:space="preserve"> visualising</w:t>
-      </w:r>
+        <w:t xml:space="preserve"> </w:t>
+      </w:r>
+      <w:proofErr w:type="spellStart"/>
+      <w:r>
+        <w:rPr>
+          <w:rFonts w:ascii="Times New Roman" w:hAnsi="Times New Roman" w:cs="Times New Roman"/>
+          <w:color w:val="0070C0"/>
+        </w:rPr>
+        <w:t>visualising</w:t>
+      </w:r>
+      <w:proofErr w:type="spellEnd"/>
       <w:r>
         <w:rPr>
           <w:rFonts w:ascii="Times New Roman" w:hAnsi="Times New Roman" w:cs="Times New Roman"/>
@@ -5234,7 +6005,27 @@
           <w:iCs/>
           <w:color w:val="0070C0"/>
         </w:rPr>
-        <w:t>Initially we merged 15 arc-second resolution terrain raster tiles (EPSG: 4326, WGS84) downloaded from GEBCO to produce a global map of surface elevation in metres. To ensure a consistent scale across raster pixels, we reprojected this elevation model (henceforth digital elevation model [DEM]) to an equal-area Mollweide projection (EPSG: 54009) using bilinear resampling. Note, the native reprojection (i.e., the use of default parameters) of the WGS84 GEBCO DEM to an equal-area Mollweide projection results in a resolution of 186.754 m. Thus, to simplify our subsequent computation of geometric indices, during this reprojection we imposed a minimum resolution of 187 m (L</w:t>
+        <w:t xml:space="preserve">Initially we merged 15 arc-second resolution terrain raster tiles (EPSG: 4326, WGS84) downloaded from GEBCO to produce a global map of surface elevation in </w:t>
+      </w:r>
+      <w:proofErr w:type="spellStart"/>
+      <w:r>
+        <w:rPr>
+          <w:rFonts w:ascii="Times New Roman" w:hAnsi="Times New Roman" w:cs="Times New Roman"/>
+          <w:i/>
+          <w:iCs/>
+          <w:color w:val="0070C0"/>
+        </w:rPr>
+        <w:t>metres</w:t>
+      </w:r>
+      <w:proofErr w:type="spellEnd"/>
+      <w:r>
+        <w:rPr>
+          <w:rFonts w:ascii="Times New Roman" w:hAnsi="Times New Roman" w:cs="Times New Roman"/>
+          <w:i/>
+          <w:iCs/>
+          <w:color w:val="0070C0"/>
+        </w:rPr>
+        <w:t>. To ensure a consistent scale across raster pixels, we reprojected this elevation model (henceforth digital elevation model [DEM]) to an equal-area Mollweide projection (EPSG: 54009) using bilinear resampling. Note, the native reprojection (i.e., the use of default parameters) of the WGS84 GEBCO DEM to an equal-area Mollweide projection results in a resolution of 186.754 m. Thus, to simplify our subsequent computation of geometric indices, during this reprojection we imposed a minimum resolution of 187 m (L</w:t>
       </w:r>
       <w:r>
         <w:rPr>
@@ -5389,11 +6180,19 @@
         </w:rPr>
         <w:t xml:space="preserve"> </w:t>
       </w:r>
-      <w:r>
-        <w:rPr>
-          <w:rFonts w:ascii="Times New Roman" w:hAnsi="Times New Roman" w:cs="Times New Roman"/>
-        </w:rPr>
-        <w:t>In order to employ the Bayesian approach, it is necessary to explicitly mention the</w:t>
+      <w:proofErr w:type="gramStart"/>
+      <w:r>
+        <w:rPr>
+          <w:rFonts w:ascii="Times New Roman" w:hAnsi="Times New Roman" w:cs="Times New Roman"/>
+        </w:rPr>
+        <w:t>In order to</w:t>
+      </w:r>
+      <w:proofErr w:type="gramEnd"/>
+      <w:r>
+        <w:rPr>
+          <w:rFonts w:ascii="Times New Roman" w:hAnsi="Times New Roman" w:cs="Times New Roman"/>
+        </w:rPr>
+        <w:t xml:space="preserve"> employ the Bayesian approach, it is necessary to explicitly mention the</w:t>
       </w:r>
       <w:r>
         <w:rPr>
@@ -5459,53 +6258,22 @@
           <w:rFonts w:ascii="Times New Roman" w:eastAsia="Times New Roman" w:hAnsi="Times New Roman" w:cs="Times New Roman"/>
           <w:color w:val="0070C0"/>
           <w:kern w:val="0"/>
+          <w:highlight w:val="yellow"/>
           <w:shd w:val="clear" w:color="auto" w:fill="FFFFFF"/>
           <w:lang w:eastAsia="en-GB"/>
           <w14:ligatures w14:val="none"/>
         </w:rPr>
         <w:lastRenderedPageBreak/>
-        <w:t>R</w:t>
-      </w:r>
-      <w:r>
-        <w:rPr>
-          <w:rFonts w:ascii="Times New Roman" w:eastAsia="Times New Roman" w:hAnsi="Times New Roman" w:cs="Times New Roman"/>
-          <w:color w:val="0070C0"/>
-          <w:kern w:val="0"/>
-          <w:shd w:val="clear" w:color="auto" w:fill="FFFFFF"/>
-          <w:lang w:eastAsia="en-GB"/>
-          <w14:ligatures w14:val="none"/>
-        </w:rPr>
-        <w:t>24</w:t>
-      </w:r>
-      <w:r>
-        <w:rPr>
-          <w:rFonts w:ascii="Times New Roman" w:eastAsia="Times New Roman" w:hAnsi="Times New Roman" w:cs="Times New Roman"/>
-          <w:color w:val="0070C0"/>
-          <w:kern w:val="0"/>
-          <w:shd w:val="clear" w:color="auto" w:fill="FFFFFF"/>
-          <w:lang w:eastAsia="en-GB"/>
-          <w14:ligatures w14:val="none"/>
-        </w:rPr>
-        <w:t>:</w:t>
-      </w:r>
-      <w:r>
-        <w:rPr>
-          <w:rFonts w:ascii="Times New Roman" w:eastAsia="Times New Roman" w:hAnsi="Times New Roman" w:cs="Times New Roman"/>
-          <w:color w:val="0070C0"/>
-          <w:kern w:val="0"/>
-          <w:shd w:val="clear" w:color="auto" w:fill="FFFFFF"/>
-          <w:lang w:eastAsia="en-GB"/>
-          <w14:ligatures w14:val="none"/>
-        </w:rPr>
-        <w:t xml:space="preserve"> </w:t>
-      </w:r>
-      <w:r>
-        <w:rPr>
-          <w:rFonts w:ascii="Times New Roman" w:eastAsia="Times New Roman" w:hAnsi="Times New Roman" w:cs="Times New Roman"/>
-          <w:i/>
-          <w:iCs/>
-          <w:color w:val="0070C0"/>
-          <w:kern w:val="0"/>
+        <w:t xml:space="preserve">R24: </w:t>
+      </w:r>
+      <w:r>
+        <w:rPr>
+          <w:rFonts w:ascii="Times New Roman" w:eastAsia="Times New Roman" w:hAnsi="Times New Roman" w:cs="Times New Roman"/>
+          <w:i/>
+          <w:iCs/>
+          <w:color w:val="0070C0"/>
+          <w:kern w:val="0"/>
+          <w:highlight w:val="yellow"/>
           <w:shd w:val="clear" w:color="auto" w:fill="FFFFFF"/>
           <w:lang w:eastAsia="en-GB"/>
           <w14:ligatures w14:val="none"/>
@@ -5519,71 +6287,83 @@
           <w:iCs/>
           <w:color w:val="0070C0"/>
           <w:kern w:val="0"/>
-          <w:shd w:val="clear" w:color="auto" w:fill="FFFFFF"/>
-          <w:lang w:eastAsia="en-GB"/>
-          <w14:ligatures w14:val="none"/>
-        </w:rPr>
-        <w:t xml:space="preserve"> (</w:t>
-      </w:r>
-      <w:r>
-        <w:rPr>
-          <w:rFonts w:ascii="Times New Roman" w:eastAsia="Times New Roman" w:hAnsi="Times New Roman" w:cs="Times New Roman"/>
-          <w:i/>
-          <w:iCs/>
-          <w:color w:val="0070C0"/>
-          <w:kern w:val="0"/>
-          <w:shd w:val="clear" w:color="auto" w:fill="FFFFFF"/>
-          <w:lang w:eastAsia="en-GB"/>
-          <w14:ligatures w14:val="none"/>
-        </w:rPr>
-        <w:t>Evaluating complexity associations</w:t>
-      </w:r>
-      <w:r>
-        <w:rPr>
-          <w:rFonts w:ascii="Times New Roman" w:eastAsia="Times New Roman" w:hAnsi="Times New Roman" w:cs="Times New Roman"/>
-          <w:i/>
-          <w:iCs/>
-          <w:color w:val="0070C0"/>
-          <w:kern w:val="0"/>
-          <w:shd w:val="clear" w:color="auto" w:fill="FFFFFF"/>
-          <w:lang w:eastAsia="en-GB"/>
-          <w14:ligatures w14:val="none"/>
-        </w:rPr>
-        <w:t>.R</w:t>
-      </w:r>
-      <w:r>
-        <w:rPr>
-          <w:rFonts w:ascii="Times New Roman" w:eastAsia="Times New Roman" w:hAnsi="Times New Roman" w:cs="Times New Roman"/>
-          <w:i/>
-          <w:iCs/>
-          <w:color w:val="0070C0"/>
-          <w:kern w:val="0"/>
+          <w:highlight w:val="yellow"/>
+          <w:shd w:val="clear" w:color="auto" w:fill="FFFFFF"/>
+          <w:lang w:eastAsia="en-GB"/>
+          <w14:ligatures w14:val="none"/>
+        </w:rPr>
+        <w:t xml:space="preserve"> (Evaluating complexity </w:t>
+      </w:r>
+      <w:proofErr w:type="spellStart"/>
+      <w:proofErr w:type="gramStart"/>
+      <w:r>
+        <w:rPr>
+          <w:rFonts w:ascii="Times New Roman" w:eastAsia="Times New Roman" w:hAnsi="Times New Roman" w:cs="Times New Roman"/>
+          <w:i/>
+          <w:iCs/>
+          <w:color w:val="0070C0"/>
+          <w:kern w:val="0"/>
+          <w:highlight w:val="yellow"/>
+          <w:shd w:val="clear" w:color="auto" w:fill="FFFFFF"/>
+          <w:lang w:eastAsia="en-GB"/>
+          <w14:ligatures w14:val="none"/>
+        </w:rPr>
+        <w:t>associations.R</w:t>
+      </w:r>
+      <w:proofErr w:type="spellEnd"/>
+      <w:proofErr w:type="gramEnd"/>
+      <w:r>
+        <w:rPr>
+          <w:rFonts w:ascii="Times New Roman" w:eastAsia="Times New Roman" w:hAnsi="Times New Roman" w:cs="Times New Roman"/>
+          <w:i/>
+          <w:iCs/>
+          <w:color w:val="0070C0"/>
+          <w:kern w:val="0"/>
+          <w:highlight w:val="yellow"/>
           <w:shd w:val="clear" w:color="auto" w:fill="FFFFFF"/>
           <w:lang w:eastAsia="en-GB"/>
           <w14:ligatures w14:val="none"/>
         </w:rPr>
         <w:t xml:space="preserve"> &amp; </w:t>
       </w:r>
-      <w:r>
-        <w:rPr>
-          <w:rFonts w:ascii="Times New Roman" w:eastAsia="Times New Roman" w:hAnsi="Times New Roman" w:cs="Times New Roman"/>
-          <w:i/>
-          <w:iCs/>
-          <w:color w:val="0070C0"/>
-          <w:kern w:val="0"/>
-          <w:shd w:val="clear" w:color="auto" w:fill="FFFFFF"/>
-          <w:lang w:eastAsia="en-GB"/>
-          <w14:ligatures w14:val="none"/>
-        </w:rPr>
-        <w:t>Analysing Complexity patterns</w:t>
-      </w:r>
-      <w:r>
-        <w:rPr>
-          <w:rFonts w:ascii="Times New Roman" w:eastAsia="Times New Roman" w:hAnsi="Times New Roman" w:cs="Times New Roman"/>
-          <w:i/>
-          <w:iCs/>
-          <w:color w:val="0070C0"/>
-          <w:kern w:val="0"/>
+      <w:proofErr w:type="spellStart"/>
+      <w:r>
+        <w:rPr>
+          <w:rFonts w:ascii="Times New Roman" w:eastAsia="Times New Roman" w:hAnsi="Times New Roman" w:cs="Times New Roman"/>
+          <w:i/>
+          <w:iCs/>
+          <w:color w:val="0070C0"/>
+          <w:kern w:val="0"/>
+          <w:highlight w:val="yellow"/>
+          <w:shd w:val="clear" w:color="auto" w:fill="FFFFFF"/>
+          <w:lang w:eastAsia="en-GB"/>
+          <w14:ligatures w14:val="none"/>
+        </w:rPr>
+        <w:t>Analysing</w:t>
+      </w:r>
+      <w:proofErr w:type="spellEnd"/>
+      <w:r>
+        <w:rPr>
+          <w:rFonts w:ascii="Times New Roman" w:eastAsia="Times New Roman" w:hAnsi="Times New Roman" w:cs="Times New Roman"/>
+          <w:i/>
+          <w:iCs/>
+          <w:color w:val="0070C0"/>
+          <w:kern w:val="0"/>
+          <w:highlight w:val="yellow"/>
+          <w:shd w:val="clear" w:color="auto" w:fill="FFFFFF"/>
+          <w:lang w:eastAsia="en-GB"/>
+          <w14:ligatures w14:val="none"/>
+        </w:rPr>
+        <w:t xml:space="preserve"> Complexity patterns</w:t>
+      </w:r>
+      <w:r>
+        <w:rPr>
+          <w:rFonts w:ascii="Times New Roman" w:eastAsia="Times New Roman" w:hAnsi="Times New Roman" w:cs="Times New Roman"/>
+          <w:i/>
+          <w:iCs/>
+          <w:color w:val="0070C0"/>
+          <w:kern w:val="0"/>
+          <w:highlight w:val="yellow"/>
           <w:shd w:val="clear" w:color="auto" w:fill="FFFFFF"/>
           <w:lang w:eastAsia="en-GB"/>
           <w14:ligatures w14:val="none"/>
@@ -5597,6 +6377,7 @@
           <w:iCs/>
           <w:color w:val="0070C0"/>
           <w:kern w:val="0"/>
+          <w:highlight w:val="yellow"/>
           <w:shd w:val="clear" w:color="auto" w:fill="FFFFFF"/>
           <w:lang w:eastAsia="en-GB"/>
           <w14:ligatures w14:val="none"/>
@@ -5858,96 +6639,26 @@
           <w:rFonts w:ascii="Times New Roman" w:eastAsia="Times New Roman" w:hAnsi="Times New Roman" w:cs="Times New Roman"/>
           <w:color w:val="0070C0"/>
           <w:kern w:val="0"/>
-          <w:shd w:val="clear" w:color="auto" w:fill="FFFFFF"/>
-          <w:lang w:eastAsia="en-GB"/>
-          <w14:ligatures w14:val="none"/>
-        </w:rPr>
-        <w:t>R</w:t>
-      </w:r>
-      <w:r>
-        <w:rPr>
-          <w:rFonts w:ascii="Times New Roman" w:eastAsia="Times New Roman" w:hAnsi="Times New Roman" w:cs="Times New Roman"/>
-          <w:color w:val="0070C0"/>
-          <w:kern w:val="0"/>
-          <w:shd w:val="clear" w:color="auto" w:fill="FFFFFF"/>
-          <w:lang w:eastAsia="en-GB"/>
-          <w14:ligatures w14:val="none"/>
-        </w:rPr>
-        <w:t>25</w:t>
-      </w:r>
-      <w:r>
-        <w:rPr>
-          <w:rFonts w:ascii="Times New Roman" w:eastAsia="Times New Roman" w:hAnsi="Times New Roman" w:cs="Times New Roman"/>
-          <w:color w:val="0070C0"/>
-          <w:kern w:val="0"/>
-          <w:shd w:val="clear" w:color="auto" w:fill="FFFFFF"/>
-          <w:lang w:eastAsia="en-GB"/>
-          <w14:ligatures w14:val="none"/>
-        </w:rPr>
-        <w:t>:</w:t>
-      </w:r>
-      <w:r>
-        <w:rPr>
-          <w:rFonts w:ascii="Times New Roman" w:eastAsia="Times New Roman" w:hAnsi="Times New Roman" w:cs="Times New Roman"/>
-          <w:color w:val="0070C0"/>
-          <w:kern w:val="0"/>
-          <w:shd w:val="clear" w:color="auto" w:fill="FFFFFF"/>
-          <w:lang w:eastAsia="en-GB"/>
-          <w14:ligatures w14:val="none"/>
-        </w:rPr>
-        <w:t xml:space="preserve"> </w:t>
-      </w:r>
-      <w:r>
-        <w:rPr>
-          <w:rFonts w:ascii="Times New Roman" w:eastAsia="Times New Roman" w:hAnsi="Times New Roman" w:cs="Times New Roman"/>
-          <w:i/>
-          <w:iCs/>
-          <w:color w:val="0070C0"/>
-          <w:kern w:val="0"/>
-          <w:shd w:val="clear" w:color="auto" w:fill="FFFFFF"/>
-          <w:lang w:eastAsia="en-GB"/>
-          <w14:ligatures w14:val="none"/>
-        </w:rPr>
-        <w:t xml:space="preserve">Opening statement thanking reviewer </w:t>
-      </w:r>
-      <w:r>
-        <w:rPr>
-          <w:rFonts w:ascii="Times New Roman" w:eastAsia="Times New Roman" w:hAnsi="Times New Roman" w:cs="Times New Roman"/>
-          <w:i/>
-          <w:iCs/>
-          <w:color w:val="0070C0"/>
-          <w:kern w:val="0"/>
-          <w:shd w:val="clear" w:color="auto" w:fill="FFFFFF"/>
-          <w:lang w:eastAsia="en-GB"/>
-          <w14:ligatures w14:val="none"/>
-        </w:rPr>
-        <w:t>3</w:t>
-      </w:r>
-      <w:r>
-        <w:rPr>
-          <w:rFonts w:ascii="Times New Roman" w:eastAsia="Times New Roman" w:hAnsi="Times New Roman" w:cs="Times New Roman"/>
-          <w:i/>
-          <w:iCs/>
-          <w:color w:val="0070C0"/>
-          <w:kern w:val="0"/>
-          <w:shd w:val="clear" w:color="auto" w:fill="FFFFFF"/>
-          <w:lang w:eastAsia="en-GB"/>
-          <w14:ligatures w14:val="none"/>
-        </w:rPr>
-        <w:t xml:space="preserve"> for their insight as to how we can improve our manuscript.</w:t>
-      </w:r>
-      <w:r>
-        <w:rPr>
-          <w:rFonts w:ascii="Times New Roman" w:eastAsia="Times New Roman" w:hAnsi="Times New Roman" w:cs="Times New Roman"/>
-          <w:i/>
-          <w:iCs/>
-          <w:color w:val="0070C0"/>
-          <w:kern w:val="0"/>
-          <w:shd w:val="clear" w:color="auto" w:fill="FFFFFF"/>
-          <w:lang w:eastAsia="en-GB"/>
-          <w14:ligatures w14:val="none"/>
-        </w:rPr>
-        <w:t xml:space="preserve"> Combine these two concerns as they relate to including more detail descriptions of the methods used in calculating the rugosity, height range and fractal dimension indices. Ensure this description appears in the main text and is adequately repeated in the methods section.</w:t>
+          <w:highlight w:val="yellow"/>
+          <w:shd w:val="clear" w:color="auto" w:fill="FFFFFF"/>
+          <w:lang w:eastAsia="en-GB"/>
+          <w14:ligatures w14:val="none"/>
+        </w:rPr>
+        <w:t xml:space="preserve">R25: </w:t>
+      </w:r>
+      <w:r>
+        <w:rPr>
+          <w:rFonts w:ascii="Times New Roman" w:eastAsia="Times New Roman" w:hAnsi="Times New Roman" w:cs="Times New Roman"/>
+          <w:i/>
+          <w:iCs/>
+          <w:color w:val="0070C0"/>
+          <w:kern w:val="0"/>
+          <w:highlight w:val="yellow"/>
+          <w:shd w:val="clear" w:color="auto" w:fill="FFFFFF"/>
+          <w:lang w:eastAsia="en-GB"/>
+          <w14:ligatures w14:val="none"/>
+        </w:rPr>
+        <w:t>Opening statement thanking reviewer 3 for their insight as to how we can improve our manuscript. Combine these two concerns as they relate to including more detail descriptions of the methods used in calculating the rugosity, height range and fractal dimension indices. Ensure this description appears in the main text and is adequately repeated in the methods section.</w:t>
       </w:r>
     </w:p>
     <w:p>
@@ -6043,7 +6754,21 @@
         <w:rPr>
           <w:rFonts w:ascii="Times New Roman" w:hAnsi="Times New Roman" w:cs="Times New Roman"/>
         </w:rPr>
-        <w:t>erent at di</w:t>
+        <w:t xml:space="preserve">erent </w:t>
+      </w:r>
+      <w:proofErr w:type="gramStart"/>
+      <w:r>
+        <w:rPr>
+          <w:rFonts w:ascii="Times New Roman" w:hAnsi="Times New Roman" w:cs="Times New Roman"/>
+        </w:rPr>
+        <w:t>at</w:t>
+      </w:r>
+      <w:proofErr w:type="gramEnd"/>
+      <w:r>
+        <w:rPr>
+          <w:rFonts w:ascii="Times New Roman" w:hAnsi="Times New Roman" w:cs="Times New Roman"/>
+        </w:rPr>
+        <w:t xml:space="preserve"> di</w:t>
       </w:r>
       <w:r>
         <w:rPr>
@@ -6055,19 +6780,75 @@
         <w:rPr>
           <w:rFonts w:ascii="Times New Roman" w:hAnsi="Times New Roman" w:cs="Times New Roman"/>
         </w:rPr>
-        <w:t>erent scale as this paper seems more focus on physical aspect at large scale.</w:t>
-      </w:r>
-      <w:r>
-        <w:rPr>
-          <w:rFonts w:ascii="Times New Roman" w:hAnsi="Times New Roman" w:cs="Times New Roman"/>
-        </w:rPr>
-        <w:t xml:space="preserve"> </w:t>
-      </w:r>
-      <w:r>
-        <w:rPr>
-          <w:rFonts w:ascii="Times New Roman" w:hAnsi="Times New Roman" w:cs="Times New Roman"/>
-        </w:rPr>
-        <w:t>That maybe good to add it in the discussion.</w:t>
+        <w:t xml:space="preserve">erent </w:t>
+      </w:r>
+      <w:proofErr w:type="gramStart"/>
+      <w:r>
+        <w:rPr>
+          <w:rFonts w:ascii="Times New Roman" w:hAnsi="Times New Roman" w:cs="Times New Roman"/>
+        </w:rPr>
+        <w:t>scale</w:t>
+      </w:r>
+      <w:proofErr w:type="gramEnd"/>
+      <w:r>
+        <w:rPr>
+          <w:rFonts w:ascii="Times New Roman" w:hAnsi="Times New Roman" w:cs="Times New Roman"/>
+        </w:rPr>
+        <w:t xml:space="preserve"> as this paper seems more </w:t>
+      </w:r>
+      <w:proofErr w:type="gramStart"/>
+      <w:r>
+        <w:rPr>
+          <w:rFonts w:ascii="Times New Roman" w:hAnsi="Times New Roman" w:cs="Times New Roman"/>
+        </w:rPr>
+        <w:t>focus</w:t>
+      </w:r>
+      <w:proofErr w:type="gramEnd"/>
+      <w:r>
+        <w:rPr>
+          <w:rFonts w:ascii="Times New Roman" w:hAnsi="Times New Roman" w:cs="Times New Roman"/>
+        </w:rPr>
+        <w:t xml:space="preserve"> on physical aspect at large scale.</w:t>
+      </w:r>
+      <w:r>
+        <w:rPr>
+          <w:rFonts w:ascii="Times New Roman" w:hAnsi="Times New Roman" w:cs="Times New Roman"/>
+        </w:rPr>
+        <w:t xml:space="preserve"> </w:t>
+      </w:r>
+      <w:r>
+        <w:rPr>
+          <w:rFonts w:ascii="Times New Roman" w:hAnsi="Times New Roman" w:cs="Times New Roman"/>
+        </w:rPr>
+        <w:t xml:space="preserve">That </w:t>
+      </w:r>
+      <w:proofErr w:type="gramStart"/>
+      <w:r>
+        <w:rPr>
+          <w:rFonts w:ascii="Times New Roman" w:hAnsi="Times New Roman" w:cs="Times New Roman"/>
+        </w:rPr>
+        <w:t>maybe</w:t>
+      </w:r>
+      <w:proofErr w:type="gramEnd"/>
+      <w:r>
+        <w:rPr>
+          <w:rFonts w:ascii="Times New Roman" w:hAnsi="Times New Roman" w:cs="Times New Roman"/>
+        </w:rPr>
+        <w:t xml:space="preserve"> good to add it </w:t>
+      </w:r>
+      <w:proofErr w:type="gramStart"/>
+      <w:r>
+        <w:rPr>
+          <w:rFonts w:ascii="Times New Roman" w:hAnsi="Times New Roman" w:cs="Times New Roman"/>
+        </w:rPr>
+        <w:t>in</w:t>
+      </w:r>
+      <w:proofErr w:type="gramEnd"/>
+      <w:r>
+        <w:rPr>
+          <w:rFonts w:ascii="Times New Roman" w:hAnsi="Times New Roman" w:cs="Times New Roman"/>
+        </w:rPr>
+        <w:t xml:space="preserve"> the discussion.</w:t>
       </w:r>
     </w:p>
     <w:p>
@@ -6325,45 +7106,6 @@
     </w:sectPr>
   </w:body>
 </w:document>
-</file>
-
-<file path=word/comments.xml><?xml version="1.0" encoding="utf-8"?>
-<w:comments xmlns:wpc="http://schemas.microsoft.com/office/word/2010/wordprocessingCanvas" xmlns:cx="http://schemas.microsoft.com/office/drawing/2014/chartex" xmlns:cx1="http://schemas.microsoft.com/office/drawing/2015/9/8/chartex" xmlns:cx2="http://schemas.microsoft.com/office/drawing/2015/10/21/chartex" xmlns:cx3="http://schemas.microsoft.com/office/drawing/2016/5/9/chartex" xmlns:cx4="http://schemas.microsoft.com/office/drawing/2016/5/10/chartex" xmlns:cx5="http://schemas.microsoft.com/office/drawing/2016/5/11/chartex" xmlns:cx6="http://schemas.microsoft.com/office/drawing/2016/5/12/chartex" xmlns:cx7="http://schemas.microsoft.com/office/drawing/2016/5/13/chartex" xmlns:cx8="http://schemas.microsoft.com/office/drawing/2016/5/14/chartex" xmlns:mc="http://schemas.openxmlformats.org/markup-compatibility/2006" xmlns:aink="http://schemas.microsoft.com/office/drawing/2016/ink" xmlns:am3d="http://schemas.microsoft.com/office/drawing/2017/model3d" xmlns:o="urn:schemas-microsoft-com:office:office" xmlns:oel="http://schemas.microsoft.com/office/2019/extlst" xmlns:r="http://schemas.openxmlformats.org/officeDocument/2006/relationships" xmlns:m="http://schemas.openxmlformats.org/officeDocument/2006/math" xmlns:v="urn:schemas-microsoft-com:vml" xmlns:wp14="http://schemas.microsoft.com/office/word/2010/wordprocessingDrawing" xmlns:wp="http://schemas.openxmlformats.org/drawingml/2006/wordprocessingDrawing" xmlns:w10="urn:schemas-microsoft-com:office:word" xmlns:w="http://schemas.openxmlformats.org/wordprocessingml/2006/main" xmlns:w14="http://schemas.microsoft.com/office/word/2010/wordml" xmlns:w15="http://schemas.microsoft.com/office/word/2012/wordml" xmlns:w16cex="http://schemas.microsoft.com/office/word/2018/wordml/cex" xmlns:w16cid="http://schemas.microsoft.com/office/word/2016/wordml/cid" xmlns:w16="http://schemas.microsoft.com/office/word/2018/wordml" xmlns:w16du="http://schemas.microsoft.com/office/word/2023/wordml/word16du" xmlns:w16sdtdh="http://schemas.microsoft.com/office/word/2020/wordml/sdtdatahash" xmlns:w16sdtfl="http://schemas.microsoft.com/office/word/2024/wordml/sdtformatlock" xmlns:w16se="http://schemas.microsoft.com/office/word/2015/wordml/symex" xmlns:wpg="http://schemas.microsoft.com/office/word/2010/wordprocessingGroup" xmlns:wpi="http://schemas.microsoft.com/office/word/2010/wordprocessingInk" xmlns:wne="http://schemas.microsoft.com/office/word/2006/wordml" xmlns:wps="http://schemas.microsoft.com/office/word/2010/wordprocessingShape" mc:Ignorable="w14 w15 w16se w16cid w16 w16cex w16sdtdh w16sdtfl w16du wp14">
-  <w:comment w:id="0" w:author="James" w:date="2026-07-01T17:17:00Z" w:initials="JC">
-    <w:p>
-      <w:pPr>
-        <w:pStyle w:val="CommentText"/>
-      </w:pPr>
-      <w:r>
-        <w:rPr>
-          <w:rStyle w:val="CommentReference"/>
-        </w:rPr>
-        <w:annotationRef/>
-      </w:r>
-      <w:r>
-        <w:t>Implement all methodology changes</w:t>
-      </w:r>
-    </w:p>
-  </w:comment>
-</w:comments>
-</file>
-
-<file path=word/commentsExtended.xml><?xml version="1.0" encoding="utf-8"?>
-<w15:commentsEx xmlns:wpc="http://schemas.microsoft.com/office/word/2010/wordprocessingCanvas" xmlns:cx="http://schemas.microsoft.com/office/drawing/2014/chartex" xmlns:cx1="http://schemas.microsoft.com/office/drawing/2015/9/8/chartex" xmlns:cx2="http://schemas.microsoft.com/office/drawing/2015/10/21/chartex" xmlns:cx3="http://schemas.microsoft.com/office/drawing/2016/5/9/chartex" xmlns:cx4="http://schemas.microsoft.com/office/drawing/2016/5/10/chartex" xmlns:cx5="http://schemas.microsoft.com/office/drawing/2016/5/11/chartex" xmlns:cx6="http://schemas.microsoft.com/office/drawing/2016/5/12/chartex" xmlns:cx7="http://schemas.microsoft.com/office/drawing/2016/5/13/chartex" xmlns:cx8="http://schemas.microsoft.com/office/drawing/2016/5/14/chartex" xmlns:mc="http://schemas.openxmlformats.org/markup-compatibility/2006" xmlns:aink="http://schemas.microsoft.com/office/drawing/2016/ink" xmlns:am3d="http://schemas.microsoft.com/office/drawing/2017/model3d" xmlns:o="urn:schemas-microsoft-com:office:office" xmlns:oel="http://schemas.microsoft.com/office/2019/extlst" xmlns:r="http://schemas.openxmlformats.org/officeDocument/2006/relationships" xmlns:m="http://schemas.openxmlformats.org/officeDocument/2006/math" xmlns:v="urn:schemas-microsoft-com:vml" xmlns:wp14="http://schemas.microsoft.com/office/word/2010/wordprocessingDrawing" xmlns:wp="http://schemas.openxmlformats.org/drawingml/2006/wordprocessingDrawing" xmlns:w10="urn:schemas-microsoft-com:office:word" xmlns:w="http://schemas.openxmlformats.org/wordprocessingml/2006/main" xmlns:w14="http://schemas.microsoft.com/office/word/2010/wordml" xmlns:w15="http://schemas.microsoft.com/office/word/2012/wordml" xmlns:w16cex="http://schemas.microsoft.com/office/word/2018/wordml/cex" xmlns:w16cid="http://schemas.microsoft.com/office/word/2016/wordml/cid" xmlns:w16="http://schemas.microsoft.com/office/word/2018/wordml" xmlns:w16du="http://schemas.microsoft.com/office/word/2023/wordml/word16du" xmlns:w16sdtdh="http://schemas.microsoft.com/office/word/2020/wordml/sdtdatahash" xmlns:w16sdtfl="http://schemas.microsoft.com/office/word/2024/wordml/sdtformatlock" xmlns:w16se="http://schemas.microsoft.com/office/word/2015/wordml/symex" xmlns:wpg="http://schemas.microsoft.com/office/word/2010/wordprocessingGroup" xmlns:wpi="http://schemas.microsoft.com/office/word/2010/wordprocessingInk" xmlns:wne="http://schemas.microsoft.com/office/word/2006/wordml" xmlns:wps="http://schemas.microsoft.com/office/word/2010/wordprocessingShape" mc:Ignorable="w14 w15 w16se w16cid w16 w16cex w16sdtdh w16sdtfl w16du wp14">
-  <w15:commentEx w15:paraId="67AE981A" w15:done="0"/>
-</w15:commentsEx>
-</file>
-
-<file path=word/commentsExtensible.xml><?xml version="1.0" encoding="utf-8"?>
-<w16cex:commentsExtensible xmlns:wpc="http://schemas.microsoft.com/office/word/2010/wordprocessingCanvas" xmlns:cx="http://schemas.microsoft.com/office/drawing/2014/chartex" xmlns:cx1="http://schemas.microsoft.com/office/drawing/2015/9/8/chartex" xmlns:cx2="http://schemas.microsoft.com/office/drawing/2015/10/21/chartex" xmlns:cx3="http://schemas.microsoft.com/office/drawing/2016/5/9/chartex" xmlns:cx4="http://schemas.microsoft.com/office/drawing/2016/5/10/chartex" xmlns:cx5="http://schemas.microsoft.com/office/drawing/2016/5/11/chartex" xmlns:cx6="http://schemas.microsoft.com/office/drawing/2016/5/12/chartex" xmlns:cx7="http://schemas.microsoft.com/office/drawing/2016/5/13/chartex" xmlns:cx8="http://schemas.microsoft.com/office/drawing/2016/5/14/chartex" xmlns:cr="http://schemas.microsoft.com/office/comments/2020/reactions" xmlns:mc="http://schemas.openxmlformats.org/markup-compatibility/2006" xmlns:aink="http://schemas.microsoft.com/office/drawing/2016/ink" xmlns:am3d="http://schemas.microsoft.com/office/drawing/2017/model3d" xmlns:o="urn:schemas-microsoft-com:office:office" xmlns:oel="http://schemas.microsoft.com/office/2019/extlst" xmlns:r="http://schemas.openxmlformats.org/officeDocument/2006/relationships" xmlns:m="http://schemas.openxmlformats.org/officeDocument/2006/math" xmlns:v="urn:schemas-microsoft-com:vml" xmlns:wp14="http://schemas.microsoft.com/office/word/2010/wordprocessingDrawing" xmlns:wp="http://schemas.openxmlformats.org/drawingml/2006/wordprocessingDrawing" xmlns:w10="urn:schemas-microsoft-com:office:word" xmlns:w="http://schemas.openxmlformats.org/wordprocessingml/2006/main" xmlns:w14="http://schemas.microsoft.com/office/word/2010/wordml" xmlns:w15="http://schemas.microsoft.com/office/word/2012/wordml" xmlns:w16cex="http://schemas.microsoft.com/office/word/2018/wordml/cex" xmlns:w16cid="http://schemas.microsoft.com/office/word/2016/wordml/cid" xmlns:w16="http://schemas.microsoft.com/office/word/2018/wordml" xmlns:w16du="http://schemas.microsoft.com/office/word/2023/wordml/word16du" xmlns:w16sdtdh="http://schemas.microsoft.com/office/word/2020/wordml/sdtdatahash" xmlns:w16sdtfl="http://schemas.microsoft.com/office/word/2024/wordml/sdtformatlock" xmlns:w16se="http://schemas.microsoft.com/office/word/2015/wordml/symex" xmlns:wpg="http://schemas.microsoft.com/office/word/2010/wordprocessingGroup" xmlns:wpi="http://schemas.microsoft.com/office/word/2010/wordprocessingInk" xmlns:wne="http://schemas.microsoft.com/office/word/2006/wordml" xmlns:wps="http://schemas.microsoft.com/office/word/2010/wordprocessingShape" mc:Ignorable="w14 w15 w16se w16cid w16 w16cex w16sdtdh w16sdtfl cr w16du wp14">
-  <w16cex:commentExtensible w16cex:durableId="00377E2C" w16cex:dateUtc="2026-07-01T16:17:00Z"/>
-</w16cex:commentsExtensible>
-</file>
-
-<file path=word/commentsIds.xml><?xml version="1.0" encoding="utf-8"?>
-<w16cid:commentsIds xmlns:wpc="http://schemas.microsoft.com/office/word/2010/wordprocessingCanvas" xmlns:cx="http://schemas.microsoft.com/office/drawing/2014/chartex" xmlns:cx1="http://schemas.microsoft.com/office/drawing/2015/9/8/chartex" xmlns:cx2="http://schemas.microsoft.com/office/drawing/2015/10/21/chartex" xmlns:cx3="http://schemas.microsoft.com/office/drawing/2016/5/9/chartex" xmlns:cx4="http://schemas.microsoft.com/office/drawing/2016/5/10/chartex" xmlns:cx5="http://schemas.microsoft.com/office/drawing/2016/5/11/chartex" xmlns:cx6="http://schemas.microsoft.com/office/drawing/2016/5/12/chartex" xmlns:cx7="http://schemas.microsoft.com/office/drawing/2016/5/13/chartex" xmlns:cx8="http://schemas.microsoft.com/office/drawing/2016/5/14/chartex" xmlns:mc="http://schemas.openxmlformats.org/markup-compatibility/2006" xmlns:aink="http://schemas.microsoft.com/office/drawing/2016/ink" xmlns:am3d="http://schemas.microsoft.com/office/drawing/2017/model3d" xmlns:o="urn:schemas-microsoft-com:office:office" xmlns:oel="http://schemas.microsoft.com/office/2019/extlst" xmlns:r="http://schemas.openxmlformats.org/officeDocument/2006/relationships" xmlns:m="http://schemas.openxmlformats.org/officeDocument/2006/math" xmlns:v="urn:schemas-microsoft-com:vml" xmlns:wp14="http://schemas.microsoft.com/office/word/2010/wordprocessingDrawing" xmlns:wp="http://schemas.openxmlformats.org/drawingml/2006/wordprocessingDrawing" xmlns:w10="urn:schemas-microsoft-com:office:word" xmlns:w="http://schemas.openxmlformats.org/wordprocessingml/2006/main" xmlns:w14="http://schemas.microsoft.com/office/word/2010/wordml" xmlns:w15="http://schemas.microsoft.com/office/word/2012/wordml" xmlns:w16cex="http://schemas.microsoft.com/office/word/2018/wordml/cex" xmlns:w16cid="http://schemas.microsoft.com/office/word/2016/wordml/cid" xmlns:w16="http://schemas.microsoft.com/office/word/2018/wordml" xmlns:w16du="http://schemas.microsoft.com/office/word/2023/wordml/word16du" xmlns:w16sdtdh="http://schemas.microsoft.com/office/word/2020/wordml/sdtdatahash" xmlns:w16sdtfl="http://schemas.microsoft.com/office/word/2024/wordml/sdtformatlock" xmlns:w16se="http://schemas.microsoft.com/office/word/2015/wordml/symex" xmlns:wpg="http://schemas.microsoft.com/office/word/2010/wordprocessingGroup" xmlns:wpi="http://schemas.microsoft.com/office/word/2010/wordprocessingInk" xmlns:wne="http://schemas.microsoft.com/office/word/2006/wordml" xmlns:wps="http://schemas.microsoft.com/office/word/2010/wordprocessingShape" mc:Ignorable="w14 w15 w16se w16cid w16 w16cex w16sdtdh w16sdtfl w16du wp14">
-  <w16cid:commentId w16cid:paraId="67AE981A" w16cid:durableId="00377E2C"/>
-</w16cid:commentsIds>
 </file>
 
 <file path=word/numbering.xml><?xml version="1.0" encoding="utf-8"?>
@@ -6645,14 +7387,6 @@
     <w:abstractNumId w:val="1"/>
   </w:num>
 </w:numbering>
-</file>
-
-<file path=word/people.xml><?xml version="1.0" encoding="utf-8"?>
-<w15:people xmlns:wpc="http://schemas.microsoft.com/office/word/2010/wordprocessingCanvas" xmlns:cx="http://schemas.microsoft.com/office/drawing/2014/chartex" xmlns:cx1="http://schemas.microsoft.com/office/drawing/2015/9/8/chartex" xmlns:cx2="http://schemas.microsoft.com/office/drawing/2015/10/21/chartex" xmlns:cx3="http://schemas.microsoft.com/office/drawing/2016/5/9/chartex" xmlns:cx4="http://schemas.microsoft.com/office/drawing/2016/5/10/chartex" xmlns:cx5="http://schemas.microsoft.com/office/drawing/2016/5/11/chartex" xmlns:cx6="http://schemas.microsoft.com/office/drawing/2016/5/12/chartex" xmlns:cx7="http://schemas.microsoft.com/office/drawing/2016/5/13/chartex" xmlns:cx8="http://schemas.microsoft.com/office/drawing/2016/5/14/chartex" xmlns:mc="http://schemas.openxmlformats.org/markup-compatibility/2006" xmlns:aink="http://schemas.microsoft.com/office/drawing/2016/ink" xmlns:am3d="http://schemas.microsoft.com/office/drawing/2017/model3d" xmlns:o="urn:schemas-microsoft-com:office:office" xmlns:oel="http://schemas.microsoft.com/office/2019/extlst" xmlns:r="http://schemas.openxmlformats.org/officeDocument/2006/relationships" xmlns:m="http://schemas.openxmlformats.org/officeDocument/2006/math" xmlns:v="urn:schemas-microsoft-com:vml" xmlns:wp14="http://schemas.microsoft.com/office/word/2010/wordprocessingDrawing" xmlns:wp="http://schemas.openxmlformats.org/drawingml/2006/wordprocessingDrawing" xmlns:w10="urn:schemas-microsoft-com:office:word" xmlns:w="http://schemas.openxmlformats.org/wordprocessingml/2006/main" xmlns:w14="http://schemas.microsoft.com/office/word/2010/wordml" xmlns:w15="http://schemas.microsoft.com/office/word/2012/wordml" xmlns:w16cex="http://schemas.microsoft.com/office/word/2018/wordml/cex" xmlns:w16cid="http://schemas.microsoft.com/office/word/2016/wordml/cid" xmlns:w16="http://schemas.microsoft.com/office/word/2018/wordml" xmlns:w16du="http://schemas.microsoft.com/office/word/2023/wordml/word16du" xmlns:w16sdtdh="http://schemas.microsoft.com/office/word/2020/wordml/sdtdatahash" xmlns:w16sdtfl="http://schemas.microsoft.com/office/word/2024/wordml/sdtformatlock" xmlns:w16se="http://schemas.microsoft.com/office/word/2015/wordml/symex" xmlns:wpg="http://schemas.microsoft.com/office/word/2010/wordprocessingGroup" xmlns:wpi="http://schemas.microsoft.com/office/word/2010/wordprocessingInk" xmlns:wne="http://schemas.microsoft.com/office/word/2006/wordml" xmlns:wps="http://schemas.microsoft.com/office/word/2010/wordprocessingShape" mc:Ignorable="w14 w15 w16se w16cid w16 w16cex w16sdtdh w16sdtfl w16du wp14">
-  <w15:person w15:author="James">
-    <w15:presenceInfo w15:providerId="None" w15:userId="James"/>
-  </w15:person>
-</w15:people>
 </file>
 
 <file path=word/styles.xml><?xml version="1.0" encoding="utf-8"?>
@@ -7967,4 +8701,16 @@
     </a:ext>
   </a:extLst>
 </a:theme>
+</file>
+
+<file path=customXml/item1.xml><?xml version="1.0" encoding="utf-8"?>
+<b:Sources xmlns:b="http://schemas.openxmlformats.org/officeDocument/2006/bibliography" xmlns="http://schemas.openxmlformats.org/officeDocument/2006/bibliography" SelectedStyle="\APASixthEditionOfficeOnline.xsl" StyleName="APA" Version="6"/>
+</file>
+
+<file path=customXml/itemProps1.xml><?xml version="1.0" encoding="utf-8"?>
+<ds:datastoreItem xmlns:ds="http://schemas.openxmlformats.org/officeDocument/2006/customXml" ds:itemID="{6EEAB8F7-6254-49E6-B8C2-18DA65BC4C89}">
+  <ds:schemaRefs>
+    <ds:schemaRef ds:uri="http://schemas.openxmlformats.org/officeDocument/2006/bibliography"/>
+  </ds:schemaRefs>
+</ds:datastoreItem>
 </file>
</xml_diff>